<commit_message>
Finalize Word agenda spacing
</commit_message>
<xml_diff>
--- a/public/one-off-requests/word-format.docx
+++ b/public/one-off-requests/word-format.docx
@@ -33,7 +33,7 @@
             <w:vAlign w:val="top"/>
             <w:tcMar>
               <w:top w:w="130" w:type="dxa"/>
-              <w:bottom w:w="0" w:type="dxa"/>
+              <w:bottom w:w="100" w:type="dxa"/>
               <w:start w:w="0" w:type="dxa"/>
               <w:end w:w="0" w:type="dxa"/>
             </w:tcMar>
@@ -63,6 +63,7 @@
           <w:p>
             <w:pPr>
               <w:pStyle w:val="CRASubtitle"/>
+              <w:spacing w:after="0"/>
             </w:pPr>
             <w:r>
               <w:t>I</w:t>
@@ -75,16 +76,20 @@
             <w:vAlign w:val="top"/>
             <w:tcMar>
               <w:top w:w="130" w:type="dxa"/>
-              <w:bottom w:w="0" w:type="dxa"/>
+              <w:bottom w:w="100" w:type="dxa"/>
               <w:start w:w="0" w:type="dxa"/>
               <w:end w:w="0" w:type="dxa"/>
             </w:tcMar>
           </w:tcPr>
           <w:p>
             <w:pPr>
-              <w:spacing w:after="0"/>
+              <w:spacing w:after="0" w:before="0" w:line="20" w:lineRule="exact"/>
             </w:pPr>
-            <w:r/>
+            <w:r>
+              <w:rPr>
+                <w:sz w:val="2"/>
+              </w:rPr>
+            </w:r>
           </w:p>
         </w:tc>
         <w:tc>
@@ -93,14 +98,17 @@
             <w:vAlign w:val="top"/>
             <w:tcMar>
               <w:top w:w="130" w:type="dxa"/>
-              <w:bottom w:w="0" w:type="dxa"/>
+              <w:bottom w:w="100" w:type="dxa"/>
               <w:start w:w="0" w:type="dxa"/>
               <w:end w:w="0" w:type="dxa"/>
             </w:tcMar>
-            <w:noWrap/>
             <w:shd w:val="clear" w:color="auto" w:fill="FFFFFF"/>
           </w:tcPr>
-          <w:p/>
+          <w:p>
+            <w:pPr>
+              <w:spacing w:before="0" w:after="0" w:line="20" w:lineRule="exact"/>
+            </w:pPr>
+          </w:p>
         </w:tc>
       </w:tr>
     </w:tbl>
@@ -110,6 +118,7 @@
         <w:tblLayout w:type="fixed"/>
         <w:tblLook w:firstColumn="1" w:firstRow="1" w:lastColumn="0" w:lastRow="0" w:noHBand="0" w:noVBand="1" w:val="04A0"/>
         <w:tblInd w:type="dxa" w:w="0"/>
+        <w:jc w:val="left"/>
       </w:tblPr>
       <w:tblGrid>
         <w:gridCol w:w="2950"/>
@@ -118,7 +127,8 @@
       </w:tblGrid>
       <w:tr>
         <w:trPr>
-          <w:trHeight w:val="575" w:hRule="atLeast"/>
+          <w:trHeight w:val="480" w:hRule="atLeast"/>
+          <w:cantSplit/>
         </w:trPr>
         <w:tc>
           <w:tcPr>
@@ -126,8 +136,8 @@
             <w:vAlign w:val="center"/>
             <w:shd w:val="clear" w:color="auto" w:fill="EDF5F0"/>
             <w:tcMar>
-              <w:top w:w="105" w:type="dxa"/>
-              <w:bottom w:w="115" w:type="dxa"/>
+              <w:top w:w="70" w:type="dxa"/>
+              <w:bottom w:w="80" w:type="dxa"/>
               <w:start w:w="180" w:type="dxa"/>
               <w:end w:w="175" w:type="dxa"/>
             </w:tcMar>
@@ -140,7 +150,7 @@
           <w:p>
             <w:pPr>
               <w:pStyle w:val="CRAMetadataLabel"/>
-              <w:spacing w:after="30"/>
+              <w:spacing w:after="20" w:before="0" w:line="240" w:lineRule="auto"/>
               <w:jc w:val="left"/>
             </w:pPr>
             <w:r>
@@ -157,7 +167,7 @@
           <w:p>
             <w:pPr>
               <w:pStyle w:val="CRAMetadataValue"/>
-              <w:spacing w:after="0"/>
+              <w:spacing w:after="0" w:before="0" w:line="240" w:lineRule="auto"/>
               <w:jc w:val="left"/>
             </w:pPr>
             <w:r>
@@ -177,8 +187,8 @@
             <w:vAlign w:val="center"/>
             <w:shd w:val="clear" w:color="auto" w:fill="EDF5F0"/>
             <w:tcMar>
-              <w:top w:w="105" w:type="dxa"/>
-              <w:bottom w:w="115" w:type="dxa"/>
+              <w:top w:w="70" w:type="dxa"/>
+              <w:bottom w:w="80" w:type="dxa"/>
               <w:start w:w="180" w:type="dxa"/>
               <w:end w:w="175" w:type="dxa"/>
             </w:tcMar>
@@ -191,7 +201,7 @@
           <w:p>
             <w:pPr>
               <w:pStyle w:val="CRAMetadataLabel"/>
-              <w:spacing w:after="30"/>
+              <w:spacing w:after="20" w:before="0" w:line="240" w:lineRule="auto"/>
               <w:jc w:val="left"/>
             </w:pPr>
             <w:r>
@@ -208,7 +218,7 @@
           <w:p>
             <w:pPr>
               <w:pStyle w:val="CRAMetadataValue"/>
-              <w:spacing w:after="0"/>
+              <w:spacing w:after="0" w:before="0" w:line="240" w:lineRule="auto"/>
               <w:jc w:val="left"/>
             </w:pPr>
             <w:r>
@@ -228,8 +238,8 @@
             <w:vAlign w:val="center"/>
             <w:shd w:val="clear" w:color="auto" w:fill="EDF5F0"/>
             <w:tcMar>
-              <w:top w:w="105" w:type="dxa"/>
-              <w:bottom w:w="115" w:type="dxa"/>
+              <w:top w:w="70" w:type="dxa"/>
+              <w:bottom w:w="80" w:type="dxa"/>
               <w:start w:w="180" w:type="dxa"/>
               <w:end w:w="175" w:type="dxa"/>
             </w:tcMar>
@@ -241,7 +251,7 @@
           <w:p>
             <w:pPr>
               <w:pStyle w:val="CRAMetadataLabel"/>
-              <w:spacing w:after="30"/>
+              <w:spacing w:after="20" w:before="0" w:line="240" w:lineRule="auto"/>
               <w:jc w:val="left"/>
             </w:pPr>
             <w:r>
@@ -258,7 +268,7 @@
           <w:p>
             <w:pPr>
               <w:pStyle w:val="CRAMetadataValue"/>
-              <w:spacing w:after="0"/>
+              <w:spacing w:after="0" w:before="0" w:line="240" w:lineRule="auto"/>
               <w:jc w:val="left"/>
             </w:pPr>
             <w:r>
@@ -306,8 +316,8 @@
         <w:tblInd w:type="dxa" w:w="0"/>
       </w:tblPr>
       <w:tblGrid>
-        <w:gridCol w:w="936"/>
-        <w:gridCol w:w="8424"/>
+        <w:gridCol w:w="1800"/>
+        <w:gridCol w:w="7560"/>
       </w:tblGrid>
       <w:tr>
         <w:trPr>
@@ -316,7 +326,7 @@
         </w:trPr>
         <w:tc>
           <w:tcPr>
-            <w:tcW w:type="dxa" w:w="936"/>
+            <w:tcW w:type="dxa" w:w="1800"/>
             <w:vAlign w:val="bottom"/>
             <w:tcMar>
               <w:top w:w="0" w:type="dxa"/>
@@ -339,7 +349,7 @@
         </w:tc>
         <w:tc>
           <w:tcPr>
-            <w:tcW w:type="dxa" w:w="8424"/>
+            <w:tcW w:type="dxa" w:w="7560"/>
             <w:vAlign w:val="bottom"/>
             <w:tcMar>
               <w:top w:w="0" w:type="dxa"/>
@@ -354,6 +364,7 @@
               <w:pBdr>
                 <w:bottom w:val="single" w:sz="4" w:space="0" w:color="DDE5E0"/>
               </w:pBdr>
+              <w:ind w:left="216" w:right="216"/>
             </w:pPr>
             <w:r>
               <w:t xml:space="preserve"> </w:t>
@@ -405,17 +416,17 @@
         <w:tc>
           <w:tcPr>
             <w:tcW w:type="dxa" w:w="1800"/>
-            <w:vAlign w:val="top"/>
+            <w:vAlign w:val="center"/>
             <w:shd w:val="clear" w:color="auto" w:fill="EEF5F1"/>
             <w:tcMar>
-              <w:top w:w="100" w:type="dxa"/>
-              <w:bottom w:w="100" w:type="dxa"/>
+              <w:top w:w="120" w:type="dxa"/>
+              <w:bottom w:w="120" w:type="dxa"/>
               <w:start w:w="0" w:type="dxa"/>
-              <w:end w:w="120" w:type="dxa"/>
+              <w:end w:w="216" w:type="dxa"/>
             </w:tcMar>
             <w:tcBorders>
-              <w:right w:val="single" w:sz="4" w:space="0" w:color="D7E4DC"/>
-              <w:bottom w:val="single" w:sz="4" w:space="0" w:color="D7E4DC"/>
+              <w:right w:val="single" w:sz="4" w:space="0" w:color="DDE5E0"/>
+              <w:bottom w:val="single" w:sz="4" w:space="0" w:color="DDE5E0"/>
             </w:tcBorders>
           </w:tcPr>
           <w:p>
@@ -441,16 +452,16 @@
         <w:tc>
           <w:tcPr>
             <w:tcW w:type="dxa" w:w="7560"/>
-            <w:vAlign w:val="top"/>
+            <w:vAlign w:val="center"/>
             <w:shd w:val="clear" w:color="auto" w:fill="FFFFFF"/>
             <w:tcMar>
               <w:top w:w="120" w:type="dxa"/>
-              <w:bottom w:w="100" w:type="dxa"/>
+              <w:bottom w:w="120" w:type="dxa"/>
               <w:start w:w="216" w:type="dxa"/>
-              <w:end w:w="72" w:type="dxa"/>
+              <w:end w:w="216" w:type="dxa"/>
             </w:tcMar>
             <w:tcBorders>
-              <w:bottom w:val="single" w:sz="4" w:space="0" w:color="D7E4DC"/>
+              <w:bottom w:val="single" w:sz="4" w:space="0" w:color="DDE5E0"/>
             </w:tcBorders>
           </w:tcPr>
           <w:p>
@@ -479,17 +490,17 @@
         <w:tc>
           <w:tcPr>
             <w:tcW w:type="dxa" w:w="1800"/>
-            <w:vAlign w:val="top"/>
+            <w:vAlign w:val="center"/>
             <w:shd w:val="clear" w:color="auto" w:fill="EEF5F1"/>
             <w:tcMar>
-              <w:top w:w="100" w:type="dxa"/>
-              <w:bottom w:w="100" w:type="dxa"/>
+              <w:top w:w="120" w:type="dxa"/>
+              <w:bottom w:w="120" w:type="dxa"/>
               <w:start w:w="0" w:type="dxa"/>
-              <w:end w:w="120" w:type="dxa"/>
+              <w:end w:w="216" w:type="dxa"/>
             </w:tcMar>
             <w:tcBorders>
-              <w:right w:val="single" w:sz="4" w:space="0" w:color="D7E4DC"/>
-              <w:bottom w:val="single" w:sz="4" w:space="0" w:color="D7E4DC"/>
+              <w:right w:val="single" w:sz="4" w:space="0" w:color="DDE5E0"/>
+              <w:bottom w:val="single" w:sz="4" w:space="0" w:color="DDE5E0"/>
             </w:tcBorders>
           </w:tcPr>
           <w:p>
@@ -515,16 +526,16 @@
         <w:tc>
           <w:tcPr>
             <w:tcW w:type="dxa" w:w="7560"/>
-            <w:vAlign w:val="top"/>
+            <w:vAlign w:val="center"/>
             <w:shd w:val="clear" w:color="auto" w:fill="FFFFFF"/>
             <w:tcMar>
               <w:top w:w="120" w:type="dxa"/>
-              <w:bottom w:w="100" w:type="dxa"/>
+              <w:bottom w:w="120" w:type="dxa"/>
               <w:start w:w="216" w:type="dxa"/>
-              <w:end w:w="72" w:type="dxa"/>
+              <w:end w:w="216" w:type="dxa"/>
             </w:tcMar>
             <w:tcBorders>
-              <w:bottom w:val="single" w:sz="4" w:space="0" w:color="D7E4DC"/>
+              <w:bottom w:val="single" w:sz="4" w:space="0" w:color="DDE5E0"/>
             </w:tcBorders>
           </w:tcPr>
           <w:p>
@@ -553,13 +564,13 @@
         <w:tc>
           <w:tcPr>
             <w:tcW w:type="dxa" w:w="1800"/>
-            <w:vAlign w:val="top"/>
+            <w:vAlign w:val="center"/>
             <w:shd w:val="clear" w:color="auto" w:fill="F2F7F4"/>
             <w:tcMar>
-              <w:top w:w="120" w:type="dxa"/>
-              <w:bottom w:w="70" w:type="dxa"/>
+              <w:top w:w="80" w:type="dxa"/>
+              <w:bottom w:w="80" w:type="dxa"/>
               <w:start w:w="0" w:type="dxa"/>
-              <w:end w:w="120" w:type="dxa"/>
+              <w:end w:w="216" w:type="dxa"/>
             </w:tcMar>
             <w:tcBorders>
               <w:top w:val="single" w:sz="4" w:space="0" w:color="D7E4DC"/>
@@ -569,6 +580,7 @@
           <w:p>
             <w:pPr>
               <w:pStyle w:val="AgendaBreakTime"/>
+              <w:jc w:val="right"/>
             </w:pPr>
             <w:r>
               <w:t>1</w:t>
@@ -578,25 +590,23 @@
         <w:tc>
           <w:tcPr>
             <w:tcW w:type="dxa" w:w="7560"/>
-            <w:vAlign w:val="top"/>
+            <w:vAlign w:val="center"/>
             <w:shd w:val="clear" w:color="auto" w:fill="F2F7F4"/>
             <w:tcMar>
-              <w:top w:w="20" w:type="dxa"/>
-              <w:bottom w:w="70" w:type="dxa"/>
+              <w:top w:w="80" w:type="dxa"/>
+              <w:bottom w:w="80" w:type="dxa"/>
               <w:start w:w="216" w:type="dxa"/>
-              <w:end w:w="72" w:type="dxa"/>
+              <w:end w:w="216" w:type="dxa"/>
             </w:tcMar>
             <w:tcBorders>
-              <w:top w:val="single" w:sz="4" w:space="0" w:color="D7E4DC"/>
+              <w:top w:val="single" w:sz="4" w:space="0" w:color="016F3B"/>
               <w:bottom w:val="single" w:sz="4" w:space="0" w:color="D7E4DC"/>
             </w:tcBorders>
           </w:tcPr>
           <w:p>
             <w:pPr>
               <w:pStyle w:val="BreakLabel"/>
-              <w:pBdr>
-                <w:top w:val="single" w:sz="8" w:space="5" w:color="016F3B"/>
-              </w:pBdr>
+              <w:jc w:val="left"/>
             </w:pPr>
             <w:r>
               <w:rPr>
@@ -627,17 +637,17 @@
         <w:tc>
           <w:tcPr>
             <w:tcW w:type="dxa" w:w="1800"/>
-            <w:vAlign w:val="top"/>
+            <w:vAlign w:val="center"/>
             <w:shd w:val="clear" w:color="auto" w:fill="EEF5F1"/>
             <w:tcMar>
-              <w:top w:w="100" w:type="dxa"/>
-              <w:bottom w:w="100" w:type="dxa"/>
+              <w:top w:w="120" w:type="dxa"/>
+              <w:bottom w:w="120" w:type="dxa"/>
               <w:start w:w="0" w:type="dxa"/>
-              <w:end w:w="120" w:type="dxa"/>
+              <w:end w:w="216" w:type="dxa"/>
             </w:tcMar>
             <w:tcBorders>
-              <w:right w:val="single" w:sz="4" w:space="0" w:color="D7E4DC"/>
-              <w:bottom w:val="single" w:sz="4" w:space="0" w:color="D7E4DC"/>
+              <w:right w:val="single" w:sz="4" w:space="0" w:color="DDE5E0"/>
+              <w:bottom w:val="single" w:sz="4" w:space="0" w:color="DDE5E0"/>
             </w:tcBorders>
           </w:tcPr>
           <w:p>
@@ -663,16 +673,16 @@
         <w:tc>
           <w:tcPr>
             <w:tcW w:type="dxa" w:w="7560"/>
-            <w:vAlign w:val="top"/>
+            <w:vAlign w:val="center"/>
             <w:shd w:val="clear" w:color="auto" w:fill="FFFFFF"/>
             <w:tcMar>
               <w:top w:w="120" w:type="dxa"/>
-              <w:bottom w:w="100" w:type="dxa"/>
+              <w:bottom w:w="120" w:type="dxa"/>
               <w:start w:w="216" w:type="dxa"/>
-              <w:end w:w="72" w:type="dxa"/>
+              <w:end w:w="216" w:type="dxa"/>
             </w:tcMar>
             <w:tcBorders>
-              <w:bottom w:val="single" w:sz="4" w:space="0" w:color="D7E4DC"/>
+              <w:bottom w:val="single" w:sz="4" w:space="0" w:color="DDE5E0"/>
             </w:tcBorders>
           </w:tcPr>
           <w:p>
@@ -701,17 +711,17 @@
         <w:tc>
           <w:tcPr>
             <w:tcW w:type="dxa" w:w="1800"/>
-            <w:vAlign w:val="top"/>
+            <w:vAlign w:val="center"/>
             <w:shd w:val="clear" w:color="auto" w:fill="EEF5F1"/>
             <w:tcMar>
-              <w:top w:w="100" w:type="dxa"/>
-              <w:bottom w:w="100" w:type="dxa"/>
+              <w:top w:w="120" w:type="dxa"/>
+              <w:bottom w:w="120" w:type="dxa"/>
               <w:start w:w="0" w:type="dxa"/>
-              <w:end w:w="120" w:type="dxa"/>
+              <w:end w:w="216" w:type="dxa"/>
             </w:tcMar>
             <w:tcBorders>
-              <w:right w:val="single" w:sz="4" w:space="0" w:color="D7E4DC"/>
-              <w:bottom w:val="single" w:sz="4" w:space="0" w:color="D7E4DC"/>
+              <w:right w:val="single" w:sz="4" w:space="0" w:color="DDE5E0"/>
+              <w:bottom w:val="single" w:sz="4" w:space="0" w:color="DDE5E0"/>
             </w:tcBorders>
           </w:tcPr>
           <w:p>
@@ -737,16 +747,16 @@
         <w:tc>
           <w:tcPr>
             <w:tcW w:type="dxa" w:w="7560"/>
-            <w:vAlign w:val="top"/>
+            <w:vAlign w:val="center"/>
             <w:shd w:val="clear" w:color="auto" w:fill="FFFFFF"/>
             <w:tcMar>
               <w:top w:w="120" w:type="dxa"/>
-              <w:bottom w:w="100" w:type="dxa"/>
+              <w:bottom w:w="120" w:type="dxa"/>
               <w:start w:w="216" w:type="dxa"/>
-              <w:end w:w="72" w:type="dxa"/>
+              <w:end w:w="216" w:type="dxa"/>
             </w:tcMar>
             <w:tcBorders>
-              <w:bottom w:val="single" w:sz="4" w:space="0" w:color="D7E4DC"/>
+              <w:bottom w:val="single" w:sz="4" w:space="0" w:color="DDE5E0"/>
             </w:tcBorders>
           </w:tcPr>
           <w:p>
@@ -775,13 +785,13 @@
         <w:tc>
           <w:tcPr>
             <w:tcW w:type="dxa" w:w="1800"/>
-            <w:vAlign w:val="top"/>
+            <w:vAlign w:val="center"/>
             <w:shd w:val="clear" w:color="auto" w:fill="F2F7F4"/>
             <w:tcMar>
-              <w:top w:w="120" w:type="dxa"/>
-              <w:bottom w:w="70" w:type="dxa"/>
+              <w:top w:w="80" w:type="dxa"/>
+              <w:bottom w:w="80" w:type="dxa"/>
               <w:start w:w="0" w:type="dxa"/>
-              <w:end w:w="120" w:type="dxa"/>
+              <w:end w:w="216" w:type="dxa"/>
             </w:tcMar>
             <w:tcBorders>
               <w:top w:val="single" w:sz="4" w:space="0" w:color="D7E4DC"/>
@@ -791,6 +801,7 @@
           <w:p>
             <w:pPr>
               <w:pStyle w:val="AgendaBreakTime"/>
+              <w:jc w:val="right"/>
             </w:pPr>
             <w:r>
               <w:t>1</w:t>
@@ -800,25 +811,23 @@
         <w:tc>
           <w:tcPr>
             <w:tcW w:type="dxa" w:w="7560"/>
-            <w:vAlign w:val="top"/>
+            <w:vAlign w:val="center"/>
             <w:shd w:val="clear" w:color="auto" w:fill="F2F7F4"/>
             <w:tcMar>
-              <w:top w:w="20" w:type="dxa"/>
-              <w:bottom w:w="70" w:type="dxa"/>
+              <w:top w:w="80" w:type="dxa"/>
+              <w:bottom w:w="80" w:type="dxa"/>
               <w:start w:w="216" w:type="dxa"/>
-              <w:end w:w="72" w:type="dxa"/>
+              <w:end w:w="216" w:type="dxa"/>
             </w:tcMar>
             <w:tcBorders>
-              <w:top w:val="single" w:sz="4" w:space="0" w:color="D7E4DC"/>
+              <w:top w:val="single" w:sz="4" w:space="0" w:color="016F3B"/>
               <w:bottom w:val="single" w:sz="4" w:space="0" w:color="D7E4DC"/>
             </w:tcBorders>
           </w:tcPr>
           <w:p>
             <w:pPr>
               <w:pStyle w:val="BreakLabel"/>
-              <w:pBdr>
-                <w:top w:val="single" w:sz="8" w:space="5" w:color="016F3B"/>
-              </w:pBdr>
+              <w:jc w:val="left"/>
             </w:pPr>
             <w:r>
               <w:rPr>
@@ -849,17 +858,17 @@
         <w:tc>
           <w:tcPr>
             <w:tcW w:type="dxa" w:w="1800"/>
-            <w:vAlign w:val="top"/>
+            <w:vAlign w:val="center"/>
             <w:shd w:val="clear" w:color="auto" w:fill="EEF5F1"/>
             <w:tcMar>
-              <w:top w:w="100" w:type="dxa"/>
-              <w:bottom w:w="100" w:type="dxa"/>
+              <w:top w:w="120" w:type="dxa"/>
+              <w:bottom w:w="120" w:type="dxa"/>
               <w:start w:w="0" w:type="dxa"/>
-              <w:end w:w="120" w:type="dxa"/>
+              <w:end w:w="216" w:type="dxa"/>
             </w:tcMar>
             <w:tcBorders>
-              <w:right w:val="single" w:sz="4" w:space="0" w:color="D7E4DC"/>
-              <w:bottom w:val="single" w:sz="4" w:space="0" w:color="D7E4DC"/>
+              <w:right w:val="single" w:sz="4" w:space="0" w:color="DDE5E0"/>
+              <w:bottom w:val="single" w:sz="4" w:space="0" w:color="DDE5E0"/>
             </w:tcBorders>
           </w:tcPr>
           <w:p>
@@ -885,16 +894,16 @@
         <w:tc>
           <w:tcPr>
             <w:tcW w:type="dxa" w:w="7560"/>
-            <w:vAlign w:val="top"/>
+            <w:vAlign w:val="center"/>
             <w:shd w:val="clear" w:color="auto" w:fill="FFFFFF"/>
             <w:tcMar>
               <w:top w:w="120" w:type="dxa"/>
-              <w:bottom w:w="100" w:type="dxa"/>
+              <w:bottom w:w="120" w:type="dxa"/>
               <w:start w:w="216" w:type="dxa"/>
-              <w:end w:w="72" w:type="dxa"/>
+              <w:end w:w="216" w:type="dxa"/>
             </w:tcMar>
             <w:tcBorders>
-              <w:bottom w:val="single" w:sz="4" w:space="0" w:color="D7E4DC"/>
+              <w:bottom w:val="single" w:sz="4" w:space="0" w:color="DDE5E0"/>
             </w:tcBorders>
           </w:tcPr>
           <w:p>
@@ -923,17 +932,17 @@
         <w:tc>
           <w:tcPr>
             <w:tcW w:type="dxa" w:w="1800"/>
-            <w:vAlign w:val="top"/>
+            <w:vAlign w:val="center"/>
             <w:shd w:val="clear" w:color="auto" w:fill="EEF5F1"/>
             <w:tcMar>
-              <w:top w:w="100" w:type="dxa"/>
-              <w:bottom w:w="100" w:type="dxa"/>
+              <w:top w:w="120" w:type="dxa"/>
+              <w:bottom w:w="120" w:type="dxa"/>
               <w:start w:w="0" w:type="dxa"/>
-              <w:end w:w="120" w:type="dxa"/>
+              <w:end w:w="216" w:type="dxa"/>
             </w:tcMar>
             <w:tcBorders>
-              <w:right w:val="single" w:sz="4" w:space="0" w:color="D7E4DC"/>
-              <w:bottom w:val="single" w:sz="4" w:space="0" w:color="D7E4DC"/>
+              <w:right w:val="single" w:sz="4" w:space="0" w:color="DDE5E0"/>
+              <w:bottom w:val="single" w:sz="4" w:space="0" w:color="DDE5E0"/>
             </w:tcBorders>
           </w:tcPr>
           <w:p>
@@ -959,16 +968,16 @@
         <w:tc>
           <w:tcPr>
             <w:tcW w:type="dxa" w:w="7560"/>
-            <w:vAlign w:val="top"/>
+            <w:vAlign w:val="center"/>
             <w:shd w:val="clear" w:color="auto" w:fill="FFFFFF"/>
             <w:tcMar>
               <w:top w:w="120" w:type="dxa"/>
-              <w:bottom w:w="100" w:type="dxa"/>
+              <w:bottom w:w="120" w:type="dxa"/>
               <w:start w:w="216" w:type="dxa"/>
-              <w:end w:w="72" w:type="dxa"/>
+              <w:end w:w="216" w:type="dxa"/>
             </w:tcMar>
             <w:tcBorders>
-              <w:bottom w:val="single" w:sz="4" w:space="0" w:color="D7E4DC"/>
+              <w:bottom w:val="single" w:sz="4" w:space="0" w:color="DDE5E0"/>
             </w:tcBorders>
           </w:tcPr>
           <w:p>
@@ -994,7 +1003,6 @@
       <w:pgSz w:w="12240" w:h="15840"/>
       <w:pgMar w:top="792" w:right="1440" w:bottom="864" w:left="1440" w:header="576" w:footer="576" w:gutter="0"/>
       <w:cols w:space="720"/>
-      <w:docGrid w:linePitch="360"/>
     </w:sectPr>
   </w:body>
 </w:document>

</xml_diff>

<commit_message>
Finalize Word agenda spacing (#487)
Co-authored-by: Mike Berry <mikeberry6@mikes-mac-mini.tailbfd1cf.ts.net>
</commit_message>
<xml_diff>
--- a/public/one-off-requests/word-format.docx
+++ b/public/one-off-requests/word-format.docx
@@ -33,7 +33,7 @@
             <w:vAlign w:val="top"/>
             <w:tcMar>
               <w:top w:w="130" w:type="dxa"/>
-              <w:bottom w:w="0" w:type="dxa"/>
+              <w:bottom w:w="100" w:type="dxa"/>
               <w:start w:w="0" w:type="dxa"/>
               <w:end w:w="0" w:type="dxa"/>
             </w:tcMar>
@@ -63,6 +63,7 @@
           <w:p>
             <w:pPr>
               <w:pStyle w:val="CRASubtitle"/>
+              <w:spacing w:after="0"/>
             </w:pPr>
             <w:r>
               <w:t>I</w:t>
@@ -75,16 +76,20 @@
             <w:vAlign w:val="top"/>
             <w:tcMar>
               <w:top w:w="130" w:type="dxa"/>
-              <w:bottom w:w="0" w:type="dxa"/>
+              <w:bottom w:w="100" w:type="dxa"/>
               <w:start w:w="0" w:type="dxa"/>
               <w:end w:w="0" w:type="dxa"/>
             </w:tcMar>
           </w:tcPr>
           <w:p>
             <w:pPr>
-              <w:spacing w:after="0"/>
+              <w:spacing w:after="0" w:before="0" w:line="20" w:lineRule="exact"/>
             </w:pPr>
-            <w:r/>
+            <w:r>
+              <w:rPr>
+                <w:sz w:val="2"/>
+              </w:rPr>
+            </w:r>
           </w:p>
         </w:tc>
         <w:tc>
@@ -93,14 +98,17 @@
             <w:vAlign w:val="top"/>
             <w:tcMar>
               <w:top w:w="130" w:type="dxa"/>
-              <w:bottom w:w="0" w:type="dxa"/>
+              <w:bottom w:w="100" w:type="dxa"/>
               <w:start w:w="0" w:type="dxa"/>
               <w:end w:w="0" w:type="dxa"/>
             </w:tcMar>
-            <w:noWrap/>
             <w:shd w:val="clear" w:color="auto" w:fill="FFFFFF"/>
           </w:tcPr>
-          <w:p/>
+          <w:p>
+            <w:pPr>
+              <w:spacing w:before="0" w:after="0" w:line="20" w:lineRule="exact"/>
+            </w:pPr>
+          </w:p>
         </w:tc>
       </w:tr>
     </w:tbl>
@@ -110,6 +118,7 @@
         <w:tblLayout w:type="fixed"/>
         <w:tblLook w:firstColumn="1" w:firstRow="1" w:lastColumn="0" w:lastRow="0" w:noHBand="0" w:noVBand="1" w:val="04A0"/>
         <w:tblInd w:type="dxa" w:w="0"/>
+        <w:jc w:val="left"/>
       </w:tblPr>
       <w:tblGrid>
         <w:gridCol w:w="2950"/>
@@ -118,7 +127,8 @@
       </w:tblGrid>
       <w:tr>
         <w:trPr>
-          <w:trHeight w:val="575" w:hRule="atLeast"/>
+          <w:trHeight w:val="480" w:hRule="atLeast"/>
+          <w:cantSplit/>
         </w:trPr>
         <w:tc>
           <w:tcPr>
@@ -126,8 +136,8 @@
             <w:vAlign w:val="center"/>
             <w:shd w:val="clear" w:color="auto" w:fill="EDF5F0"/>
             <w:tcMar>
-              <w:top w:w="105" w:type="dxa"/>
-              <w:bottom w:w="115" w:type="dxa"/>
+              <w:top w:w="70" w:type="dxa"/>
+              <w:bottom w:w="80" w:type="dxa"/>
               <w:start w:w="180" w:type="dxa"/>
               <w:end w:w="175" w:type="dxa"/>
             </w:tcMar>
@@ -140,7 +150,7 @@
           <w:p>
             <w:pPr>
               <w:pStyle w:val="CRAMetadataLabel"/>
-              <w:spacing w:after="30"/>
+              <w:spacing w:after="20" w:before="0" w:line="240" w:lineRule="auto"/>
               <w:jc w:val="left"/>
             </w:pPr>
             <w:r>
@@ -157,7 +167,7 @@
           <w:p>
             <w:pPr>
               <w:pStyle w:val="CRAMetadataValue"/>
-              <w:spacing w:after="0"/>
+              <w:spacing w:after="0" w:before="0" w:line="240" w:lineRule="auto"/>
               <w:jc w:val="left"/>
             </w:pPr>
             <w:r>
@@ -177,8 +187,8 @@
             <w:vAlign w:val="center"/>
             <w:shd w:val="clear" w:color="auto" w:fill="EDF5F0"/>
             <w:tcMar>
-              <w:top w:w="105" w:type="dxa"/>
-              <w:bottom w:w="115" w:type="dxa"/>
+              <w:top w:w="70" w:type="dxa"/>
+              <w:bottom w:w="80" w:type="dxa"/>
               <w:start w:w="180" w:type="dxa"/>
               <w:end w:w="175" w:type="dxa"/>
             </w:tcMar>
@@ -191,7 +201,7 @@
           <w:p>
             <w:pPr>
               <w:pStyle w:val="CRAMetadataLabel"/>
-              <w:spacing w:after="30"/>
+              <w:spacing w:after="20" w:before="0" w:line="240" w:lineRule="auto"/>
               <w:jc w:val="left"/>
             </w:pPr>
             <w:r>
@@ -208,7 +218,7 @@
           <w:p>
             <w:pPr>
               <w:pStyle w:val="CRAMetadataValue"/>
-              <w:spacing w:after="0"/>
+              <w:spacing w:after="0" w:before="0" w:line="240" w:lineRule="auto"/>
               <w:jc w:val="left"/>
             </w:pPr>
             <w:r>
@@ -228,8 +238,8 @@
             <w:vAlign w:val="center"/>
             <w:shd w:val="clear" w:color="auto" w:fill="EDF5F0"/>
             <w:tcMar>
-              <w:top w:w="105" w:type="dxa"/>
-              <w:bottom w:w="115" w:type="dxa"/>
+              <w:top w:w="70" w:type="dxa"/>
+              <w:bottom w:w="80" w:type="dxa"/>
               <w:start w:w="180" w:type="dxa"/>
               <w:end w:w="175" w:type="dxa"/>
             </w:tcMar>
@@ -241,7 +251,7 @@
           <w:p>
             <w:pPr>
               <w:pStyle w:val="CRAMetadataLabel"/>
-              <w:spacing w:after="30"/>
+              <w:spacing w:after="20" w:before="0" w:line="240" w:lineRule="auto"/>
               <w:jc w:val="left"/>
             </w:pPr>
             <w:r>
@@ -258,7 +268,7 @@
           <w:p>
             <w:pPr>
               <w:pStyle w:val="CRAMetadataValue"/>
-              <w:spacing w:after="0"/>
+              <w:spacing w:after="0" w:before="0" w:line="240" w:lineRule="auto"/>
               <w:jc w:val="left"/>
             </w:pPr>
             <w:r>
@@ -306,8 +316,8 @@
         <w:tblInd w:type="dxa" w:w="0"/>
       </w:tblPr>
       <w:tblGrid>
-        <w:gridCol w:w="936"/>
-        <w:gridCol w:w="8424"/>
+        <w:gridCol w:w="1800"/>
+        <w:gridCol w:w="7560"/>
       </w:tblGrid>
       <w:tr>
         <w:trPr>
@@ -316,7 +326,7 @@
         </w:trPr>
         <w:tc>
           <w:tcPr>
-            <w:tcW w:type="dxa" w:w="936"/>
+            <w:tcW w:type="dxa" w:w="1800"/>
             <w:vAlign w:val="bottom"/>
             <w:tcMar>
               <w:top w:w="0" w:type="dxa"/>
@@ -339,7 +349,7 @@
         </w:tc>
         <w:tc>
           <w:tcPr>
-            <w:tcW w:type="dxa" w:w="8424"/>
+            <w:tcW w:type="dxa" w:w="7560"/>
             <w:vAlign w:val="bottom"/>
             <w:tcMar>
               <w:top w:w="0" w:type="dxa"/>
@@ -354,6 +364,7 @@
               <w:pBdr>
                 <w:bottom w:val="single" w:sz="4" w:space="0" w:color="DDE5E0"/>
               </w:pBdr>
+              <w:ind w:left="216" w:right="216"/>
             </w:pPr>
             <w:r>
               <w:t xml:space="preserve"> </w:t>
@@ -405,17 +416,17 @@
         <w:tc>
           <w:tcPr>
             <w:tcW w:type="dxa" w:w="1800"/>
-            <w:vAlign w:val="top"/>
+            <w:vAlign w:val="center"/>
             <w:shd w:val="clear" w:color="auto" w:fill="EEF5F1"/>
             <w:tcMar>
-              <w:top w:w="100" w:type="dxa"/>
-              <w:bottom w:w="100" w:type="dxa"/>
+              <w:top w:w="120" w:type="dxa"/>
+              <w:bottom w:w="120" w:type="dxa"/>
               <w:start w:w="0" w:type="dxa"/>
-              <w:end w:w="120" w:type="dxa"/>
+              <w:end w:w="216" w:type="dxa"/>
             </w:tcMar>
             <w:tcBorders>
-              <w:right w:val="single" w:sz="4" w:space="0" w:color="D7E4DC"/>
-              <w:bottom w:val="single" w:sz="4" w:space="0" w:color="D7E4DC"/>
+              <w:right w:val="single" w:sz="4" w:space="0" w:color="DDE5E0"/>
+              <w:bottom w:val="single" w:sz="4" w:space="0" w:color="DDE5E0"/>
             </w:tcBorders>
           </w:tcPr>
           <w:p>
@@ -441,16 +452,16 @@
         <w:tc>
           <w:tcPr>
             <w:tcW w:type="dxa" w:w="7560"/>
-            <w:vAlign w:val="top"/>
+            <w:vAlign w:val="center"/>
             <w:shd w:val="clear" w:color="auto" w:fill="FFFFFF"/>
             <w:tcMar>
               <w:top w:w="120" w:type="dxa"/>
-              <w:bottom w:w="100" w:type="dxa"/>
+              <w:bottom w:w="120" w:type="dxa"/>
               <w:start w:w="216" w:type="dxa"/>
-              <w:end w:w="72" w:type="dxa"/>
+              <w:end w:w="216" w:type="dxa"/>
             </w:tcMar>
             <w:tcBorders>
-              <w:bottom w:val="single" w:sz="4" w:space="0" w:color="D7E4DC"/>
+              <w:bottom w:val="single" w:sz="4" w:space="0" w:color="DDE5E0"/>
             </w:tcBorders>
           </w:tcPr>
           <w:p>
@@ -479,17 +490,17 @@
         <w:tc>
           <w:tcPr>
             <w:tcW w:type="dxa" w:w="1800"/>
-            <w:vAlign w:val="top"/>
+            <w:vAlign w:val="center"/>
             <w:shd w:val="clear" w:color="auto" w:fill="EEF5F1"/>
             <w:tcMar>
-              <w:top w:w="100" w:type="dxa"/>
-              <w:bottom w:w="100" w:type="dxa"/>
+              <w:top w:w="120" w:type="dxa"/>
+              <w:bottom w:w="120" w:type="dxa"/>
               <w:start w:w="0" w:type="dxa"/>
-              <w:end w:w="120" w:type="dxa"/>
+              <w:end w:w="216" w:type="dxa"/>
             </w:tcMar>
             <w:tcBorders>
-              <w:right w:val="single" w:sz="4" w:space="0" w:color="D7E4DC"/>
-              <w:bottom w:val="single" w:sz="4" w:space="0" w:color="D7E4DC"/>
+              <w:right w:val="single" w:sz="4" w:space="0" w:color="DDE5E0"/>
+              <w:bottom w:val="single" w:sz="4" w:space="0" w:color="DDE5E0"/>
             </w:tcBorders>
           </w:tcPr>
           <w:p>
@@ -515,16 +526,16 @@
         <w:tc>
           <w:tcPr>
             <w:tcW w:type="dxa" w:w="7560"/>
-            <w:vAlign w:val="top"/>
+            <w:vAlign w:val="center"/>
             <w:shd w:val="clear" w:color="auto" w:fill="FFFFFF"/>
             <w:tcMar>
               <w:top w:w="120" w:type="dxa"/>
-              <w:bottom w:w="100" w:type="dxa"/>
+              <w:bottom w:w="120" w:type="dxa"/>
               <w:start w:w="216" w:type="dxa"/>
-              <w:end w:w="72" w:type="dxa"/>
+              <w:end w:w="216" w:type="dxa"/>
             </w:tcMar>
             <w:tcBorders>
-              <w:bottom w:val="single" w:sz="4" w:space="0" w:color="D7E4DC"/>
+              <w:bottom w:val="single" w:sz="4" w:space="0" w:color="DDE5E0"/>
             </w:tcBorders>
           </w:tcPr>
           <w:p>
@@ -553,13 +564,13 @@
         <w:tc>
           <w:tcPr>
             <w:tcW w:type="dxa" w:w="1800"/>
-            <w:vAlign w:val="top"/>
+            <w:vAlign w:val="center"/>
             <w:shd w:val="clear" w:color="auto" w:fill="F2F7F4"/>
             <w:tcMar>
-              <w:top w:w="120" w:type="dxa"/>
-              <w:bottom w:w="70" w:type="dxa"/>
+              <w:top w:w="80" w:type="dxa"/>
+              <w:bottom w:w="80" w:type="dxa"/>
               <w:start w:w="0" w:type="dxa"/>
-              <w:end w:w="120" w:type="dxa"/>
+              <w:end w:w="216" w:type="dxa"/>
             </w:tcMar>
             <w:tcBorders>
               <w:top w:val="single" w:sz="4" w:space="0" w:color="D7E4DC"/>
@@ -569,6 +580,7 @@
           <w:p>
             <w:pPr>
               <w:pStyle w:val="AgendaBreakTime"/>
+              <w:jc w:val="right"/>
             </w:pPr>
             <w:r>
               <w:t>1</w:t>
@@ -578,25 +590,23 @@
         <w:tc>
           <w:tcPr>
             <w:tcW w:type="dxa" w:w="7560"/>
-            <w:vAlign w:val="top"/>
+            <w:vAlign w:val="center"/>
             <w:shd w:val="clear" w:color="auto" w:fill="F2F7F4"/>
             <w:tcMar>
-              <w:top w:w="20" w:type="dxa"/>
-              <w:bottom w:w="70" w:type="dxa"/>
+              <w:top w:w="80" w:type="dxa"/>
+              <w:bottom w:w="80" w:type="dxa"/>
               <w:start w:w="216" w:type="dxa"/>
-              <w:end w:w="72" w:type="dxa"/>
+              <w:end w:w="216" w:type="dxa"/>
             </w:tcMar>
             <w:tcBorders>
-              <w:top w:val="single" w:sz="4" w:space="0" w:color="D7E4DC"/>
+              <w:top w:val="single" w:sz="4" w:space="0" w:color="016F3B"/>
               <w:bottom w:val="single" w:sz="4" w:space="0" w:color="D7E4DC"/>
             </w:tcBorders>
           </w:tcPr>
           <w:p>
             <w:pPr>
               <w:pStyle w:val="BreakLabel"/>
-              <w:pBdr>
-                <w:top w:val="single" w:sz="8" w:space="5" w:color="016F3B"/>
-              </w:pBdr>
+              <w:jc w:val="left"/>
             </w:pPr>
             <w:r>
               <w:rPr>
@@ -627,17 +637,17 @@
         <w:tc>
           <w:tcPr>
             <w:tcW w:type="dxa" w:w="1800"/>
-            <w:vAlign w:val="top"/>
+            <w:vAlign w:val="center"/>
             <w:shd w:val="clear" w:color="auto" w:fill="EEF5F1"/>
             <w:tcMar>
-              <w:top w:w="100" w:type="dxa"/>
-              <w:bottom w:w="100" w:type="dxa"/>
+              <w:top w:w="120" w:type="dxa"/>
+              <w:bottom w:w="120" w:type="dxa"/>
               <w:start w:w="0" w:type="dxa"/>
-              <w:end w:w="120" w:type="dxa"/>
+              <w:end w:w="216" w:type="dxa"/>
             </w:tcMar>
             <w:tcBorders>
-              <w:right w:val="single" w:sz="4" w:space="0" w:color="D7E4DC"/>
-              <w:bottom w:val="single" w:sz="4" w:space="0" w:color="D7E4DC"/>
+              <w:right w:val="single" w:sz="4" w:space="0" w:color="DDE5E0"/>
+              <w:bottom w:val="single" w:sz="4" w:space="0" w:color="DDE5E0"/>
             </w:tcBorders>
           </w:tcPr>
           <w:p>
@@ -663,16 +673,16 @@
         <w:tc>
           <w:tcPr>
             <w:tcW w:type="dxa" w:w="7560"/>
-            <w:vAlign w:val="top"/>
+            <w:vAlign w:val="center"/>
             <w:shd w:val="clear" w:color="auto" w:fill="FFFFFF"/>
             <w:tcMar>
               <w:top w:w="120" w:type="dxa"/>
-              <w:bottom w:w="100" w:type="dxa"/>
+              <w:bottom w:w="120" w:type="dxa"/>
               <w:start w:w="216" w:type="dxa"/>
-              <w:end w:w="72" w:type="dxa"/>
+              <w:end w:w="216" w:type="dxa"/>
             </w:tcMar>
             <w:tcBorders>
-              <w:bottom w:val="single" w:sz="4" w:space="0" w:color="D7E4DC"/>
+              <w:bottom w:val="single" w:sz="4" w:space="0" w:color="DDE5E0"/>
             </w:tcBorders>
           </w:tcPr>
           <w:p>
@@ -701,17 +711,17 @@
         <w:tc>
           <w:tcPr>
             <w:tcW w:type="dxa" w:w="1800"/>
-            <w:vAlign w:val="top"/>
+            <w:vAlign w:val="center"/>
             <w:shd w:val="clear" w:color="auto" w:fill="EEF5F1"/>
             <w:tcMar>
-              <w:top w:w="100" w:type="dxa"/>
-              <w:bottom w:w="100" w:type="dxa"/>
+              <w:top w:w="120" w:type="dxa"/>
+              <w:bottom w:w="120" w:type="dxa"/>
               <w:start w:w="0" w:type="dxa"/>
-              <w:end w:w="120" w:type="dxa"/>
+              <w:end w:w="216" w:type="dxa"/>
             </w:tcMar>
             <w:tcBorders>
-              <w:right w:val="single" w:sz="4" w:space="0" w:color="D7E4DC"/>
-              <w:bottom w:val="single" w:sz="4" w:space="0" w:color="D7E4DC"/>
+              <w:right w:val="single" w:sz="4" w:space="0" w:color="DDE5E0"/>
+              <w:bottom w:val="single" w:sz="4" w:space="0" w:color="DDE5E0"/>
             </w:tcBorders>
           </w:tcPr>
           <w:p>
@@ -737,16 +747,16 @@
         <w:tc>
           <w:tcPr>
             <w:tcW w:type="dxa" w:w="7560"/>
-            <w:vAlign w:val="top"/>
+            <w:vAlign w:val="center"/>
             <w:shd w:val="clear" w:color="auto" w:fill="FFFFFF"/>
             <w:tcMar>
               <w:top w:w="120" w:type="dxa"/>
-              <w:bottom w:w="100" w:type="dxa"/>
+              <w:bottom w:w="120" w:type="dxa"/>
               <w:start w:w="216" w:type="dxa"/>
-              <w:end w:w="72" w:type="dxa"/>
+              <w:end w:w="216" w:type="dxa"/>
             </w:tcMar>
             <w:tcBorders>
-              <w:bottom w:val="single" w:sz="4" w:space="0" w:color="D7E4DC"/>
+              <w:bottom w:val="single" w:sz="4" w:space="0" w:color="DDE5E0"/>
             </w:tcBorders>
           </w:tcPr>
           <w:p>
@@ -775,13 +785,13 @@
         <w:tc>
           <w:tcPr>
             <w:tcW w:type="dxa" w:w="1800"/>
-            <w:vAlign w:val="top"/>
+            <w:vAlign w:val="center"/>
             <w:shd w:val="clear" w:color="auto" w:fill="F2F7F4"/>
             <w:tcMar>
-              <w:top w:w="120" w:type="dxa"/>
-              <w:bottom w:w="70" w:type="dxa"/>
+              <w:top w:w="80" w:type="dxa"/>
+              <w:bottom w:w="80" w:type="dxa"/>
               <w:start w:w="0" w:type="dxa"/>
-              <w:end w:w="120" w:type="dxa"/>
+              <w:end w:w="216" w:type="dxa"/>
             </w:tcMar>
             <w:tcBorders>
               <w:top w:val="single" w:sz="4" w:space="0" w:color="D7E4DC"/>
@@ -791,6 +801,7 @@
           <w:p>
             <w:pPr>
               <w:pStyle w:val="AgendaBreakTime"/>
+              <w:jc w:val="right"/>
             </w:pPr>
             <w:r>
               <w:t>1</w:t>
@@ -800,25 +811,23 @@
         <w:tc>
           <w:tcPr>
             <w:tcW w:type="dxa" w:w="7560"/>
-            <w:vAlign w:val="top"/>
+            <w:vAlign w:val="center"/>
             <w:shd w:val="clear" w:color="auto" w:fill="F2F7F4"/>
             <w:tcMar>
-              <w:top w:w="20" w:type="dxa"/>
-              <w:bottom w:w="70" w:type="dxa"/>
+              <w:top w:w="80" w:type="dxa"/>
+              <w:bottom w:w="80" w:type="dxa"/>
               <w:start w:w="216" w:type="dxa"/>
-              <w:end w:w="72" w:type="dxa"/>
+              <w:end w:w="216" w:type="dxa"/>
             </w:tcMar>
             <w:tcBorders>
-              <w:top w:val="single" w:sz="4" w:space="0" w:color="D7E4DC"/>
+              <w:top w:val="single" w:sz="4" w:space="0" w:color="016F3B"/>
               <w:bottom w:val="single" w:sz="4" w:space="0" w:color="D7E4DC"/>
             </w:tcBorders>
           </w:tcPr>
           <w:p>
             <w:pPr>
               <w:pStyle w:val="BreakLabel"/>
-              <w:pBdr>
-                <w:top w:val="single" w:sz="8" w:space="5" w:color="016F3B"/>
-              </w:pBdr>
+              <w:jc w:val="left"/>
             </w:pPr>
             <w:r>
               <w:rPr>
@@ -849,17 +858,17 @@
         <w:tc>
           <w:tcPr>
             <w:tcW w:type="dxa" w:w="1800"/>
-            <w:vAlign w:val="top"/>
+            <w:vAlign w:val="center"/>
             <w:shd w:val="clear" w:color="auto" w:fill="EEF5F1"/>
             <w:tcMar>
-              <w:top w:w="100" w:type="dxa"/>
-              <w:bottom w:w="100" w:type="dxa"/>
+              <w:top w:w="120" w:type="dxa"/>
+              <w:bottom w:w="120" w:type="dxa"/>
               <w:start w:w="0" w:type="dxa"/>
-              <w:end w:w="120" w:type="dxa"/>
+              <w:end w:w="216" w:type="dxa"/>
             </w:tcMar>
             <w:tcBorders>
-              <w:right w:val="single" w:sz="4" w:space="0" w:color="D7E4DC"/>
-              <w:bottom w:val="single" w:sz="4" w:space="0" w:color="D7E4DC"/>
+              <w:right w:val="single" w:sz="4" w:space="0" w:color="DDE5E0"/>
+              <w:bottom w:val="single" w:sz="4" w:space="0" w:color="DDE5E0"/>
             </w:tcBorders>
           </w:tcPr>
           <w:p>
@@ -885,16 +894,16 @@
         <w:tc>
           <w:tcPr>
             <w:tcW w:type="dxa" w:w="7560"/>
-            <w:vAlign w:val="top"/>
+            <w:vAlign w:val="center"/>
             <w:shd w:val="clear" w:color="auto" w:fill="FFFFFF"/>
             <w:tcMar>
               <w:top w:w="120" w:type="dxa"/>
-              <w:bottom w:w="100" w:type="dxa"/>
+              <w:bottom w:w="120" w:type="dxa"/>
               <w:start w:w="216" w:type="dxa"/>
-              <w:end w:w="72" w:type="dxa"/>
+              <w:end w:w="216" w:type="dxa"/>
             </w:tcMar>
             <w:tcBorders>
-              <w:bottom w:val="single" w:sz="4" w:space="0" w:color="D7E4DC"/>
+              <w:bottom w:val="single" w:sz="4" w:space="0" w:color="DDE5E0"/>
             </w:tcBorders>
           </w:tcPr>
           <w:p>
@@ -923,17 +932,17 @@
         <w:tc>
           <w:tcPr>
             <w:tcW w:type="dxa" w:w="1800"/>
-            <w:vAlign w:val="top"/>
+            <w:vAlign w:val="center"/>
             <w:shd w:val="clear" w:color="auto" w:fill="EEF5F1"/>
             <w:tcMar>
-              <w:top w:w="100" w:type="dxa"/>
-              <w:bottom w:w="100" w:type="dxa"/>
+              <w:top w:w="120" w:type="dxa"/>
+              <w:bottom w:w="120" w:type="dxa"/>
               <w:start w:w="0" w:type="dxa"/>
-              <w:end w:w="120" w:type="dxa"/>
+              <w:end w:w="216" w:type="dxa"/>
             </w:tcMar>
             <w:tcBorders>
-              <w:right w:val="single" w:sz="4" w:space="0" w:color="D7E4DC"/>
-              <w:bottom w:val="single" w:sz="4" w:space="0" w:color="D7E4DC"/>
+              <w:right w:val="single" w:sz="4" w:space="0" w:color="DDE5E0"/>
+              <w:bottom w:val="single" w:sz="4" w:space="0" w:color="DDE5E0"/>
             </w:tcBorders>
           </w:tcPr>
           <w:p>
@@ -959,16 +968,16 @@
         <w:tc>
           <w:tcPr>
             <w:tcW w:type="dxa" w:w="7560"/>
-            <w:vAlign w:val="top"/>
+            <w:vAlign w:val="center"/>
             <w:shd w:val="clear" w:color="auto" w:fill="FFFFFF"/>
             <w:tcMar>
               <w:top w:w="120" w:type="dxa"/>
-              <w:bottom w:w="100" w:type="dxa"/>
+              <w:bottom w:w="120" w:type="dxa"/>
               <w:start w:w="216" w:type="dxa"/>
-              <w:end w:w="72" w:type="dxa"/>
+              <w:end w:w="216" w:type="dxa"/>
             </w:tcMar>
             <w:tcBorders>
-              <w:bottom w:val="single" w:sz="4" w:space="0" w:color="D7E4DC"/>
+              <w:bottom w:val="single" w:sz="4" w:space="0" w:color="DDE5E0"/>
             </w:tcBorders>
           </w:tcPr>
           <w:p>
@@ -994,7 +1003,6 @@
       <w:pgSz w:w="12240" w:h="15840"/>
       <w:pgMar w:top="792" w:right="1440" w:bottom="864" w:left="1440" w:header="576" w:footer="576" w:gutter="0"/>
       <w:cols w:space="720"/>
-      <w:docGrid w:linePitch="360"/>
     </w:sectPr>
   </w:body>
 </w:document>

</xml_diff>

<commit_message>
Update Word agenda template
</commit_message>
<xml_diff>
--- a/public/one-off-requests/word-format.docx
+++ b/public/one-off-requests/word-format.docx
@@ -26,14 +26,15 @@
       <w:tr>
         <w:trPr>
           <w:cantSplit/>
+          <w:trHeight w:val="480" w:hRule="atLeast"/>
         </w:trPr>
         <w:tc>
           <w:tcPr>
             <w:tcW w:type="dxa" w:w="6984"/>
             <w:vAlign w:val="top"/>
             <w:tcMar>
-              <w:top w:w="130" w:type="dxa"/>
-              <w:bottom w:w="100" w:type="dxa"/>
+              <w:top w:w="90" w:type="dxa"/>
+              <w:bottom w:w="25" w:type="dxa"/>
               <w:start w:w="0" w:type="dxa"/>
               <w:end w:w="0" w:type="dxa"/>
             </w:tcMar>
@@ -49,34 +50,14 @@
               <w:t>C</w:t>
             </w:r>
           </w:p>
-          <w:p>
-            <w:pPr>
-              <w:pStyle w:val="CRAEditorialTitle"/>
-            </w:pPr>
-            <w:r>
-              <w:t>S</w:t>
-            </w:r>
-            <w:r>
-              <w:t/>
-            </w:r>
-          </w:p>
-          <w:p>
-            <w:pPr>
-              <w:pStyle w:val="CRASubtitle"/>
-              <w:spacing w:after="0"/>
-            </w:pPr>
-            <w:r>
-              <w:t>I</w:t>
-            </w:r>
-          </w:p>
         </w:tc>
         <w:tc>
           <w:tcPr>
             <w:tcW w:type="dxa" w:w="432"/>
             <w:vAlign w:val="top"/>
             <w:tcMar>
-              <w:top w:w="130" w:type="dxa"/>
-              <w:bottom w:w="100" w:type="dxa"/>
+              <w:top w:w="90" w:type="dxa"/>
+              <w:bottom w:w="25" w:type="dxa"/>
               <w:start w:w="0" w:type="dxa"/>
               <w:end w:w="0" w:type="dxa"/>
             </w:tcMar>
@@ -97,8 +78,8 @@
             <w:tcW w:type="dxa" w:w="1944"/>
             <w:vAlign w:val="top"/>
             <w:tcMar>
-              <w:top w:w="130" w:type="dxa"/>
-              <w:bottom w:w="100" w:type="dxa"/>
+              <w:top w:w="125" w:type="dxa"/>
+              <w:bottom w:w="0" w:type="dxa"/>
               <w:start w:w="0" w:type="dxa"/>
               <w:end w:w="0" w:type="dxa"/>
             </w:tcMar>
@@ -106,8 +87,47 @@
           </w:tcPr>
           <w:p>
             <w:pPr>
-              <w:spacing w:before="0" w:after="0" w:line="20" w:lineRule="exact"/>
+              <w:pStyle w:val="CRALogo"/>
             </w:pPr>
+            <w:r/>
+          </w:p>
+        </w:tc>
+      </w:tr>
+      <w:tr>
+        <w:trPr>
+          <w:cantSplit/>
+        </w:trPr>
+        <w:tc>
+          <w:tcPr>
+            <w:tcW w:type="dxa" w:w="9360"/>
+            <w:gridSpan w:val="3"/>
+            <w:tcMar>
+              <w:top w:w="35" w:type="dxa"/>
+              <w:start w:w="0" w:type="dxa"/>
+              <w:bottom w:w="110" w:type="dxa"/>
+              <w:end w:w="0" w:type="dxa"/>
+            </w:tcMar>
+            <w:vAlign w:val="top"/>
+          </w:tcPr>
+          <w:p>
+            <w:pPr>
+              <w:pStyle w:val="CRAEditorialTitle"/>
+            </w:pPr>
+            <w:r>
+              <w:t>S</w:t>
+            </w:r>
+            <w:r>
+              <w:t/>
+            </w:r>
+          </w:p>
+          <w:p>
+            <w:pPr>
+              <w:pStyle w:val="CRASubtitle"/>
+              <w:spacing w:after="0"/>
+            </w:pPr>
+            <w:r>
+              <w:t xml:space="preserve">I</w:t>
+            </w:r>
           </w:p>
         </w:tc>
       </w:tr>
@@ -119,6 +139,9 @@
         <w:tblLook w:firstColumn="1" w:firstRow="1" w:lastColumn="0" w:lastRow="0" w:noHBand="0" w:noVBand="1" w:val="04A0"/>
         <w:tblInd w:type="dxa" w:w="0"/>
         <w:jc w:val="left"/>
+        <w:tblBorders>
+          <w:insideV w:val="nil"/>
+        </w:tblBorders>
       </w:tblPr>
       <w:tblGrid>
         <w:gridCol w:w="2950"/>
@@ -127,24 +150,27 @@
       </w:tblGrid>
       <w:tr>
         <w:trPr>
-          <w:trHeight w:val="480" w:hRule="atLeast"/>
+          <w:trHeight w:val="420" w:hRule="atLeast"/>
           <w:cantSplit/>
         </w:trPr>
         <w:tc>
           <w:tcPr>
             <w:tcW w:type="dxa" w:w="2950"/>
             <w:vAlign w:val="center"/>
-            <w:shd w:val="clear" w:color="auto" w:fill="EDF5F0"/>
+            <w:shd w:val="clear" w:color="auto" w:fill="F5F8F6"/>
             <w:tcMar>
-              <w:top w:w="70" w:type="dxa"/>
-              <w:bottom w:w="80" w:type="dxa"/>
+              <w:top w:w="55" w:type="dxa"/>
+              <w:bottom w:w="60" w:type="dxa"/>
               <w:start w:w="180" w:type="dxa"/>
               <w:end w:w="175" w:type="dxa"/>
             </w:tcMar>
             <w:tcBorders>
               <w:top w:val="single" w:sz="8" w:space="0" w:color="016F3B"/>
               <w:bottom w:val="single" w:sz="4" w:space="0" w:color="D7E4DC"/>
-              <w:right w:val="single" w:sz="4" w:space="0" w:color="D7E4DC"/>
+              <w:right w:val="nil" w:sz="4" w:space="0" w:color="D7E4DC"/>
+              <w:start w:val="nil"/>
+              <w:end w:val="nil"/>
+              <w:left w:val="nil"/>
             </w:tcBorders>
           </w:tcPr>
           <w:p>
@@ -175,7 +201,9 @@
                 <w:rFonts w:ascii="Arial" w:hAnsi="Arial" w:eastAsia="Arial" w:cs="Arial"/>
                 <w:b w:val="0"/>
                 <w:color w:val="142019"/>
-                <w:sz w:val="18"/>
+                <w:sz w:val="17"/>
+                <w:bCs w:val="0"/>
+                <w:szCs w:val="17"/>
               </w:rPr>
               <w:t>A</w:t>
             </w:r>
@@ -185,17 +213,20 @@
           <w:tcPr>
             <w:tcW w:type="dxa" w:w="3100"/>
             <w:vAlign w:val="center"/>
-            <w:shd w:val="clear" w:color="auto" w:fill="EDF5F0"/>
+            <w:shd w:val="clear" w:color="auto" w:fill="F5F8F6"/>
             <w:tcMar>
-              <w:top w:w="70" w:type="dxa"/>
-              <w:bottom w:w="80" w:type="dxa"/>
+              <w:top w:w="55" w:type="dxa"/>
+              <w:bottom w:w="60" w:type="dxa"/>
               <w:start w:w="180" w:type="dxa"/>
               <w:end w:w="175" w:type="dxa"/>
             </w:tcMar>
             <w:tcBorders>
               <w:top w:val="single" w:sz="8" w:space="0" w:color="016F3B"/>
               <w:bottom w:val="single" w:sz="4" w:space="0" w:color="D7E4DC"/>
-              <w:right w:val="single" w:sz="4" w:space="0" w:color="D7E4DC"/>
+              <w:right w:val="nil" w:sz="4" w:space="0" w:color="D7E4DC"/>
+              <w:start w:val="nil"/>
+              <w:end w:val="nil"/>
+              <w:left w:val="nil"/>
             </w:tcBorders>
           </w:tcPr>
           <w:p>
@@ -224,9 +255,11 @@
             <w:r>
               <w:rPr>
                 <w:rFonts w:ascii="Arial" w:hAnsi="Arial" w:eastAsia="Arial" w:cs="Arial"/>
-                <w:b/>
+                <w:b w:val="0"/>
                 <w:color w:val="142019"/>
-                <w:sz w:val="18"/>
+                <w:sz w:val="17"/>
+                <w:bCs w:val="0"/>
+                <w:szCs w:val="17"/>
               </w:rPr>
               <w:t>8</w:t>
             </w:r>
@@ -236,16 +269,20 @@
           <w:tcPr>
             <w:tcW w:type="dxa" w:w="3310"/>
             <w:vAlign w:val="center"/>
-            <w:shd w:val="clear" w:color="auto" w:fill="EDF5F0"/>
+            <w:shd w:val="clear" w:color="auto" w:fill="F5F8F6"/>
             <w:tcMar>
-              <w:top w:w="70" w:type="dxa"/>
-              <w:bottom w:w="80" w:type="dxa"/>
+              <w:top w:w="55" w:type="dxa"/>
+              <w:bottom w:w="60" w:type="dxa"/>
               <w:start w:w="180" w:type="dxa"/>
               <w:end w:w="175" w:type="dxa"/>
             </w:tcMar>
             <w:tcBorders>
               <w:top w:val="single" w:sz="8" w:space="0" w:color="016F3B"/>
               <w:bottom w:val="single" w:sz="4" w:space="0" w:color="D7E4DC"/>
+              <w:start w:val="nil"/>
+              <w:end w:val="nil"/>
+              <w:left w:val="nil"/>
+              <w:right w:val="nil"/>
             </w:tcBorders>
           </w:tcPr>
           <w:p>
@@ -276,7 +313,9 @@
                 <w:rFonts w:ascii="Arial" w:hAnsi="Arial" w:eastAsia="Arial" w:cs="Arial"/>
                 <w:b w:val="0"/>
                 <w:color w:val="142019"/>
-                <w:sz w:val="18"/>
+                <w:sz w:val="17"/>
+                <w:bCs w:val="0"/>
+                <w:szCs w:val="17"/>
               </w:rPr>
               <w:t>C</w:t>
             </w:r>
@@ -316,24 +355,34 @@
         <w:tblInd w:type="dxa" w:w="0"/>
       </w:tblPr>
       <w:tblGrid>
-        <w:gridCol w:w="1800"/>
-        <w:gridCol w:w="7560"/>
+        <w:gridCol w:w="1512"/>
+        <w:gridCol w:w="7848"/>
       </w:tblGrid>
       <w:tr>
         <w:trPr>
           <w:cantSplit/>
-          <w:trHeight w:val="180" w:hRule="atLeast"/>
+          <w:trHeight w:val="230" w:hRule="atLeast"/>
         </w:trPr>
         <w:tc>
           <w:tcPr>
-            <w:tcW w:type="dxa" w:w="1800"/>
+            <w:tcW w:type="dxa" w:w="9360"/>
             <w:vAlign w:val="bottom"/>
             <w:tcMar>
-              <w:top w:w="0" w:type="dxa"/>
-              <w:bottom w:w="0" w:type="dxa"/>
+              <w:top w:w="45" w:type="dxa"/>
+              <w:bottom w:w="60" w:type="dxa"/>
               <w:start w:w="0" w:type="dxa"/>
               <w:end w:w="0" w:type="dxa"/>
             </w:tcMar>
+            <w:gridSpan w:val="2"/>
+            <w:shd w:val="clear" w:color="auto" w:fill="FFFFFF"/>
+            <w:tcBorders>
+              <w:top w:val="nil"/>
+              <w:start w:val="nil"/>
+              <w:end w:val="nil"/>
+              <w:left w:val="nil"/>
+              <w:right w:val="nil"/>
+              <w:bottom w:val="single" w:sz="4" w:space="0" w:color="DFE6E2"/>
+            </w:tcBorders>
           </w:tcPr>
           <w:p>
             <w:pPr>
@@ -344,30 +393,6 @@
                 <w:spacing w:val="10"/>
               </w:rPr>
               <w:t>A</w:t>
-            </w:r>
-          </w:p>
-        </w:tc>
-        <w:tc>
-          <w:tcPr>
-            <w:tcW w:type="dxa" w:w="7560"/>
-            <w:vAlign w:val="bottom"/>
-            <w:tcMar>
-              <w:top w:w="0" w:type="dxa"/>
-              <w:bottom w:w="0" w:type="dxa"/>
-              <w:start w:w="0" w:type="dxa"/>
-              <w:end w:w="0" w:type="dxa"/>
-            </w:tcMar>
-          </w:tcPr>
-          <w:p>
-            <w:pPr>
-              <w:spacing w:before="0" w:after="0" w:line="140" w:lineRule="exact"/>
-              <w:pBdr>
-                <w:bottom w:val="single" w:sz="4" w:space="0" w:color="DDE5E0"/>
-              </w:pBdr>
-              <w:ind w:left="216" w:right="216"/>
-            </w:pPr>
-            <w:r>
-              <w:t xml:space="preserve"> </w:t>
             </w:r>
           </w:p>
         </w:tc>
@@ -405,63 +430,106 @@
         <w:tblInd w:type="dxa" w:w="0"/>
       </w:tblPr>
       <w:tblGrid>
-        <w:gridCol w:w="1800"/>
-        <w:gridCol w:w="7560"/>
+        <w:gridCol w:w="1512"/>
+        <w:gridCol w:w="7848"/>
       </w:tblGrid>
       <w:tr>
         <w:trPr>
           <w:cantSplit/>
-          <w:trHeight w:val="1425" w:hRule="atLeast"/>
+          <w:trHeight w:val="1240" w:hRule="atLeast"/>
         </w:trPr>
         <w:tc>
           <w:tcPr>
-            <w:tcW w:type="dxa" w:w="1800"/>
-            <w:vAlign w:val="center"/>
-            <w:shd w:val="clear" w:color="auto" w:fill="EEF5F1"/>
+            <w:tcW w:type="dxa" w:w="1512"/>
+            <w:vAlign w:val="top"/>
+            <w:shd w:val="clear" w:color="auto" w:fill="EAF2ED"/>
             <w:tcMar>
-              <w:top w:w="120" w:type="dxa"/>
-              <w:bottom w:w="120" w:type="dxa"/>
-              <w:start w:w="0" w:type="dxa"/>
-              <w:end w:w="216" w:type="dxa"/>
+              <w:top w:w="170" w:type="dxa"/>
+              <w:bottom w:w="90" w:type="dxa"/>
+              <w:start w:w="170" w:type="dxa"/>
+              <w:end w:w="50" w:type="dxa"/>
             </w:tcMar>
             <w:tcBorders>
-              <w:right w:val="single" w:sz="4" w:space="0" w:color="DDE5E0"/>
-              <w:bottom w:val="single" w:sz="4" w:space="0" w:color="DDE5E0"/>
+              <w:right w:val="nil" w:sz="4" w:space="0" w:color="DDE5E0"/>
+              <w:bottom w:val="single" w:sz="16" w:space="0" w:color="FFFFFF"/>
+              <w:end w:val="nil"/>
+              <w:top w:val="single" w:sz="16" w:space="0" w:color="FFFFFF"/>
             </w:tcBorders>
           </w:tcPr>
           <w:p>
             <w:pPr>
-              <w:pStyle w:val="SessionNumber"/>
+              <w:pStyle w:val="AgendaTime"/>
+              <w:jc w:val="left"/>
+              <w:ind w:left="0" w:right="0" w:firstLine="0" w:hanging="0"/>
+              <w:spacing w:before="0" w:after="0"/>
             </w:pPr>
             <w:r>
               <w:rPr>
-                <w:spacing w:val="3"/>
+                <w:rFonts w:ascii="Arial" w:hAnsi="Arial" w:cs="Arial"/>
+                <w:b w:val="1"/>
+                <w:bCs w:val="1"/>
+                <w:color w:val="142019"/>
+                <w:sz w:val="26"/>
+                <w:szCs w:val="26"/>
               </w:rPr>
-              <w:t>0</w:t>
+              <w:t>8</w:t>
             </w:r>
-          </w:p>
-          <w:p>
-            <w:pPr>
-              <w:pStyle w:val="AgendaTime"/>
-            </w:pPr>
             <w:r>
-              <w:t>8</w:t>
+              <w:br/>
+            </w:r>
+            <w:r>
+              <w:rPr>
+                <w:rFonts w:ascii="Arial" w:hAnsi="Arial" w:cs="Arial"/>
+                <w:b w:val="1"/>
+                <w:bCs w:val="1"/>
+                <w:color w:val="657169"/>
+                <w:sz w:val="13"/>
+                <w:szCs w:val="13"/>
+                <w:spacing w:val="4"/>
+              </w:rPr>
+              <w:t/>
+            </w:r>
+            <w:r>
+              <w:rPr>
+                <w:rFonts w:ascii="Arial" w:hAnsi="Arial" w:cs="Arial"/>
+                <w:b w:val="0"/>
+                <w:bCs w:val="0"/>
+                <w:color w:val="8A948E"/>
+                <w:sz w:val="13"/>
+                <w:szCs w:val="13"/>
+              </w:rPr>
+              <w:t xml:space="preserve"/>
+            </w:r>
+            <w:r>
+              <w:rPr>
+                <w:rFonts w:ascii="Arial" w:hAnsi="Arial" w:cs="Arial"/>
+                <w:b w:val="1"/>
+                <w:bCs w:val="1"/>
+                <w:color w:val="016F3B"/>
+                <w:sz w:val="13"/>
+                <w:szCs w:val="13"/>
+                <w:spacing w:val="4"/>
+              </w:rPr>
+              <w:t/>
             </w:r>
           </w:p>
         </w:tc>
         <w:tc>
           <w:tcPr>
-            <w:tcW w:type="dxa" w:w="7560"/>
-            <w:vAlign w:val="center"/>
+            <w:tcW w:type="dxa" w:w="7848"/>
+            <w:vAlign w:val="top"/>
             <w:shd w:val="clear" w:color="auto" w:fill="FFFFFF"/>
             <w:tcMar>
-              <w:top w:w="120" w:type="dxa"/>
-              <w:bottom w:w="120" w:type="dxa"/>
+              <w:top w:w="170" w:type="dxa"/>
+              <w:bottom w:w="90" w:type="dxa"/>
               <w:start w:w="216" w:type="dxa"/>
               <w:end w:w="216" w:type="dxa"/>
             </w:tcMar>
             <w:tcBorders>
-              <w:bottom w:val="single" w:sz="4" w:space="0" w:color="DDE5E0"/>
+              <w:bottom w:val="nil" w:sz="4" w:space="0" w:color="DDE5E0"/>
+              <w:left w:val="nil"/>
+              <w:start w:val="nil"/>
+              <w:top w:val="nil"/>
             </w:tcBorders>
           </w:tcPr>
           <w:p>
@@ -485,57 +553,100 @@
       <w:tr>
         <w:trPr>
           <w:cantSplit/>
-          <w:trHeight w:val="1425" w:hRule="atLeast"/>
+          <w:trHeight w:val="1240" w:hRule="atLeast"/>
         </w:trPr>
         <w:tc>
           <w:tcPr>
-            <w:tcW w:type="dxa" w:w="1800"/>
-            <w:vAlign w:val="center"/>
-            <w:shd w:val="clear" w:color="auto" w:fill="EEF5F1"/>
+            <w:tcW w:type="dxa" w:w="1512"/>
+            <w:vAlign w:val="top"/>
+            <w:shd w:val="clear" w:color="auto" w:fill="EAF2ED"/>
             <w:tcMar>
-              <w:top w:w="120" w:type="dxa"/>
-              <w:bottom w:w="120" w:type="dxa"/>
-              <w:start w:w="0" w:type="dxa"/>
-              <w:end w:w="216" w:type="dxa"/>
+              <w:top w:w="170" w:type="dxa"/>
+              <w:bottom w:w="90" w:type="dxa"/>
+              <w:start w:w="170" w:type="dxa"/>
+              <w:end w:w="50" w:type="dxa"/>
             </w:tcMar>
             <w:tcBorders>
-              <w:right w:val="single" w:sz="4" w:space="0" w:color="DDE5E0"/>
-              <w:bottom w:val="single" w:sz="4" w:space="0" w:color="DDE5E0"/>
+              <w:right w:val="nil" w:sz="4" w:space="0" w:color="DDE5E0"/>
+              <w:bottom w:val="single" w:sz="16" w:space="0" w:color="FFFFFF"/>
+              <w:end w:val="nil"/>
+              <w:top w:val="single" w:sz="16" w:space="0" w:color="FFFFFF"/>
             </w:tcBorders>
           </w:tcPr>
           <w:p>
             <w:pPr>
-              <w:pStyle w:val="SessionNumber"/>
+              <w:pStyle w:val="AgendaTime"/>
+              <w:jc w:val="left"/>
+              <w:ind w:left="0" w:right="0" w:firstLine="0" w:hanging="0"/>
+              <w:spacing w:before="0" w:after="0"/>
             </w:pPr>
             <w:r>
               <w:rPr>
-                <w:spacing w:val="3"/>
+                <w:rFonts w:ascii="Arial" w:hAnsi="Arial" w:cs="Arial"/>
+                <w:b w:val="1"/>
+                <w:bCs w:val="1"/>
+                <w:color w:val="142019"/>
+                <w:sz w:val="26"/>
+                <w:szCs w:val="26"/>
               </w:rPr>
-              <w:t>0</w:t>
+              <w:t>9</w:t>
             </w:r>
-          </w:p>
-          <w:p>
-            <w:pPr>
-              <w:pStyle w:val="AgendaTime"/>
-            </w:pPr>
             <w:r>
-              <w:t>9</w:t>
+              <w:br/>
+            </w:r>
+            <w:r>
+              <w:rPr>
+                <w:rFonts w:ascii="Arial" w:hAnsi="Arial" w:cs="Arial"/>
+                <w:b w:val="1"/>
+                <w:bCs w:val="1"/>
+                <w:color w:val="657169"/>
+                <w:sz w:val="13"/>
+                <w:szCs w:val="13"/>
+                <w:spacing w:val="4"/>
+              </w:rPr>
+              <w:t/>
+            </w:r>
+            <w:r>
+              <w:rPr>
+                <w:rFonts w:ascii="Arial" w:hAnsi="Arial" w:cs="Arial"/>
+                <w:b w:val="0"/>
+                <w:bCs w:val="0"/>
+                <w:color w:val="8A948E"/>
+                <w:sz w:val="13"/>
+                <w:szCs w:val="13"/>
+              </w:rPr>
+              <w:t xml:space="preserve"/>
+            </w:r>
+            <w:r>
+              <w:rPr>
+                <w:rFonts w:ascii="Arial" w:hAnsi="Arial" w:cs="Arial"/>
+                <w:b w:val="1"/>
+                <w:bCs w:val="1"/>
+                <w:color w:val="016F3B"/>
+                <w:sz w:val="13"/>
+                <w:szCs w:val="13"/>
+                <w:spacing w:val="4"/>
+              </w:rPr>
+              <w:t/>
             </w:r>
           </w:p>
         </w:tc>
         <w:tc>
           <w:tcPr>
-            <w:tcW w:type="dxa" w:w="7560"/>
-            <w:vAlign w:val="center"/>
+            <w:tcW w:type="dxa" w:w="7848"/>
+            <w:vAlign w:val="top"/>
             <w:shd w:val="clear" w:color="auto" w:fill="FFFFFF"/>
             <w:tcMar>
-              <w:top w:w="120" w:type="dxa"/>
-              <w:bottom w:w="120" w:type="dxa"/>
+              <w:top w:w="170" w:type="dxa"/>
+              <w:bottom w:w="90" w:type="dxa"/>
               <w:start w:w="216" w:type="dxa"/>
               <w:end w:w="216" w:type="dxa"/>
             </w:tcMar>
             <w:tcBorders>
-              <w:bottom w:val="single" w:sz="4" w:space="0" w:color="DDE5E0"/>
+              <w:bottom w:val="nil" w:sz="4" w:space="0" w:color="DDE5E0"/>
+              <w:left w:val="nil"/>
+              <w:start w:val="nil"/>
+              <w:top w:val="nil"/>
             </w:tcBorders>
           </w:tcPr>
           <w:p>
@@ -559,72 +670,112 @@
       <w:tr>
         <w:trPr>
           <w:cantSplit/>
-          <w:trHeight w:val="480" w:hRule="atLeast"/>
+          <w:trHeight w:val="400" w:hRule="atLeast"/>
         </w:trPr>
         <w:tc>
           <w:tcPr>
-            <w:tcW w:type="dxa" w:w="1800"/>
+            <w:tcW w:type="dxa" w:w="1512"/>
             <w:vAlign w:val="center"/>
             <w:shd w:val="clear" w:color="auto" w:fill="F2F7F4"/>
             <w:tcMar>
-              <w:top w:w="80" w:type="dxa"/>
-              <w:bottom w:w="80" w:type="dxa"/>
-              <w:start w:w="0" w:type="dxa"/>
-              <w:end w:w="216" w:type="dxa"/>
+              <w:top w:w="55" w:type="dxa"/>
+              <w:bottom w:w="55" w:type="dxa"/>
+              <w:start w:w="170" w:type="dxa"/>
+              <w:end w:w="50" w:type="dxa"/>
             </w:tcMar>
             <w:tcBorders>
-              <w:top w:val="single" w:sz="4" w:space="0" w:color="D7E4DC"/>
-              <w:bottom w:val="single" w:sz="4" w:space="0" w:color="D7E4DC"/>
+              <w:top w:val="single" w:sz="8" w:space="0" w:color="FFFFFF"/>
+              <w:bottom w:val="single" w:sz="8" w:space="0" w:color="FFFFFF"/>
+              <w:right w:val="nil"/>
+              <w:end w:val="nil"/>
             </w:tcBorders>
           </w:tcPr>
           <w:p>
             <w:pPr>
               <w:pStyle w:val="AgendaBreakTime"/>
-              <w:jc w:val="right"/>
+              <w:jc w:val="left"/>
+              <w:ind w:left="0" w:right="0" w:firstLine="0" w:hanging="0"/>
+              <w:spacing w:before="0" w:after="0"/>
             </w:pPr>
             <w:r>
+              <w:rPr>
+                <w:rFonts w:ascii="Arial" w:hAnsi="Arial" w:cs="Arial"/>
+                <w:b w:val="1"/>
+                <w:bCs w:val="1"/>
+                <w:color w:val="46534B"/>
+                <w:sz w:val="17"/>
+                <w:szCs w:val="17"/>
+              </w:rPr>
               <w:t>1</w:t>
+            </w:r>
+            <w:r>
+              <w:rPr>
+                <w:rFonts w:ascii="Arial" w:hAnsi="Arial" w:cs="Arial"/>
+                <w:b w:val="0"/>
+                <w:bCs w:val="0"/>
+                <w:color w:val="657169"/>
+                <w:sz w:val="14"/>
+                <w:szCs w:val="14"/>
+                <w:spacing w:val="3"/>
+              </w:rPr>
+              <w:t xml:space="preserve"/>
             </w:r>
           </w:p>
         </w:tc>
         <w:tc>
           <w:tcPr>
-            <w:tcW w:type="dxa" w:w="7560"/>
+            <w:tcW w:type="dxa" w:w="7848"/>
             <w:vAlign w:val="center"/>
             <w:shd w:val="clear" w:color="auto" w:fill="F2F7F4"/>
             <w:tcMar>
-              <w:top w:w="80" w:type="dxa"/>
-              <w:bottom w:w="80" w:type="dxa"/>
+              <w:top w:w="55" w:type="dxa"/>
+              <w:bottom w:w="55" w:type="dxa"/>
               <w:start w:w="216" w:type="dxa"/>
               <w:end w:w="216" w:type="dxa"/>
             </w:tcMar>
             <w:tcBorders>
-              <w:top w:val="single" w:sz="4" w:space="0" w:color="016F3B"/>
-              <w:bottom w:val="single" w:sz="4" w:space="0" w:color="D7E4DC"/>
+              <w:top w:val="single" w:sz="8" w:space="0" w:color="FFFFFF"/>
+              <w:bottom w:val="single" w:sz="8" w:space="0" w:color="FFFFFF"/>
+              <w:left w:val="nil"/>
+              <w:start w:val="nil"/>
             </w:tcBorders>
           </w:tcPr>
           <w:p>
             <w:pPr>
               <w:pStyle w:val="BreakLabel"/>
               <w:jc w:val="left"/>
+              <w:ind w:left="0" w:right="0" w:firstLine="0" w:hanging="0"/>
+              <w:spacing w:before="0" w:after="0"/>
+              <w:tabs>
+                <w:tab w:val="right" w:pos="7420"/>
+              </w:tabs>
             </w:pPr>
             <w:r>
               <w:rPr>
-                <w:rFonts w:ascii="Arial" w:hAnsi="Arial" w:eastAsia="Arial" w:cs="Arial"/>
-                <w:b/>
+                <w:rFonts w:ascii="Arial" w:hAnsi="Arial" w:cs="Arial"/>
+                <w:b w:val="1"/>
+                <w:bCs w:val="1"/>
                 <w:color w:val="016F3B"/>
                 <w:sz w:val="16"/>
+                <w:szCs w:val="16"/>
+                <w:spacing w:val="2"/>
               </w:rPr>
               <w:t>C</w:t>
             </w:r>
             <w:r>
+              <w:tab/>
+            </w:r>
+            <w:r>
               <w:rPr>
-                <w:rFonts w:ascii="Arial" w:hAnsi="Arial" w:eastAsia="Arial" w:cs="Arial"/>
+                <w:rFonts w:ascii="Arial" w:hAnsi="Arial" w:cs="Arial"/>
                 <w:b w:val="0"/>
+                <w:bCs w:val="0"/>
                 <w:color w:val="657169"/>
                 <w:sz w:val="15"/>
+                <w:szCs w:val="15"/>
+                <w:spacing w:val="4"/>
               </w:rPr>
-              <w:t xml:space="preserve"/>
+              <w:t/>
             </w:r>
           </w:p>
         </w:tc>
@@ -632,57 +783,100 @@
       <w:tr>
         <w:trPr>
           <w:cantSplit/>
-          <w:trHeight w:val="1425" w:hRule="atLeast"/>
+          <w:trHeight w:val="1240" w:hRule="atLeast"/>
         </w:trPr>
         <w:tc>
           <w:tcPr>
-            <w:tcW w:type="dxa" w:w="1800"/>
-            <w:vAlign w:val="center"/>
-            <w:shd w:val="clear" w:color="auto" w:fill="EEF5F1"/>
+            <w:tcW w:type="dxa" w:w="1512"/>
+            <w:vAlign w:val="top"/>
+            <w:shd w:val="clear" w:color="auto" w:fill="EAF2ED"/>
             <w:tcMar>
-              <w:top w:w="120" w:type="dxa"/>
-              <w:bottom w:w="120" w:type="dxa"/>
-              <w:start w:w="0" w:type="dxa"/>
-              <w:end w:w="216" w:type="dxa"/>
+              <w:top w:w="170" w:type="dxa"/>
+              <w:bottom w:w="90" w:type="dxa"/>
+              <w:start w:w="170" w:type="dxa"/>
+              <w:end w:w="50" w:type="dxa"/>
             </w:tcMar>
             <w:tcBorders>
-              <w:right w:val="single" w:sz="4" w:space="0" w:color="DDE5E0"/>
-              <w:bottom w:val="single" w:sz="4" w:space="0" w:color="DDE5E0"/>
+              <w:right w:val="nil" w:sz="4" w:space="0" w:color="DDE5E0"/>
+              <w:bottom w:val="single" w:sz="16" w:space="0" w:color="FFFFFF"/>
+              <w:end w:val="nil"/>
+              <w:top w:val="single" w:sz="16" w:space="0" w:color="FFFFFF"/>
             </w:tcBorders>
           </w:tcPr>
           <w:p>
             <w:pPr>
-              <w:pStyle w:val="SessionNumber"/>
+              <w:pStyle w:val="AgendaTime"/>
+              <w:jc w:val="left"/>
+              <w:ind w:left="0" w:right="0" w:firstLine="0" w:hanging="0"/>
+              <w:spacing w:before="0" w:after="0"/>
             </w:pPr>
             <w:r>
               <w:rPr>
-                <w:spacing w:val="3"/>
+                <w:rFonts w:ascii="Arial" w:hAnsi="Arial" w:cs="Arial"/>
+                <w:b w:val="1"/>
+                <w:bCs w:val="1"/>
+                <w:color w:val="142019"/>
+                <w:sz w:val="26"/>
+                <w:szCs w:val="26"/>
               </w:rPr>
-              <w:t>0</w:t>
+              <w:t>1</w:t>
             </w:r>
-          </w:p>
-          <w:p>
-            <w:pPr>
-              <w:pStyle w:val="AgendaTime"/>
-            </w:pPr>
             <w:r>
-              <w:t>1</w:t>
+              <w:br/>
+            </w:r>
+            <w:r>
+              <w:rPr>
+                <w:rFonts w:ascii="Arial" w:hAnsi="Arial" w:cs="Arial"/>
+                <w:b w:val="1"/>
+                <w:bCs w:val="1"/>
+                <w:color w:val="657169"/>
+                <w:sz w:val="13"/>
+                <w:szCs w:val="13"/>
+                <w:spacing w:val="4"/>
+              </w:rPr>
+              <w:t/>
+            </w:r>
+            <w:r>
+              <w:rPr>
+                <w:rFonts w:ascii="Arial" w:hAnsi="Arial" w:cs="Arial"/>
+                <w:b w:val="0"/>
+                <w:bCs w:val="0"/>
+                <w:color w:val="8A948E"/>
+                <w:sz w:val="13"/>
+                <w:szCs w:val="13"/>
+              </w:rPr>
+              <w:t xml:space="preserve"/>
+            </w:r>
+            <w:r>
+              <w:rPr>
+                <w:rFonts w:ascii="Arial" w:hAnsi="Arial" w:cs="Arial"/>
+                <w:b w:val="1"/>
+                <w:bCs w:val="1"/>
+                <w:color w:val="016F3B"/>
+                <w:sz w:val="13"/>
+                <w:szCs w:val="13"/>
+                <w:spacing w:val="4"/>
+              </w:rPr>
+              <w:t/>
             </w:r>
           </w:p>
         </w:tc>
         <w:tc>
           <w:tcPr>
-            <w:tcW w:type="dxa" w:w="7560"/>
-            <w:vAlign w:val="center"/>
+            <w:tcW w:type="dxa" w:w="7848"/>
+            <w:vAlign w:val="top"/>
             <w:shd w:val="clear" w:color="auto" w:fill="FFFFFF"/>
             <w:tcMar>
-              <w:top w:w="120" w:type="dxa"/>
-              <w:bottom w:w="120" w:type="dxa"/>
+              <w:top w:w="170" w:type="dxa"/>
+              <w:bottom w:w="90" w:type="dxa"/>
               <w:start w:w="216" w:type="dxa"/>
               <w:end w:w="216" w:type="dxa"/>
             </w:tcMar>
             <w:tcBorders>
-              <w:bottom w:val="single" w:sz="4" w:space="0" w:color="DDE5E0"/>
+              <w:bottom w:val="nil" w:sz="4" w:space="0" w:color="DDE5E0"/>
+              <w:left w:val="nil"/>
+              <w:start w:val="nil"/>
+              <w:top w:val="nil"/>
             </w:tcBorders>
           </w:tcPr>
           <w:p>
@@ -706,57 +900,100 @@
       <w:tr>
         <w:trPr>
           <w:cantSplit/>
-          <w:trHeight w:val="1425" w:hRule="atLeast"/>
+          <w:trHeight w:val="1240" w:hRule="atLeast"/>
         </w:trPr>
         <w:tc>
           <w:tcPr>
-            <w:tcW w:type="dxa" w:w="1800"/>
-            <w:vAlign w:val="center"/>
-            <w:shd w:val="clear" w:color="auto" w:fill="EEF5F1"/>
+            <w:tcW w:type="dxa" w:w="1512"/>
+            <w:vAlign w:val="top"/>
+            <w:shd w:val="clear" w:color="auto" w:fill="EAF2ED"/>
             <w:tcMar>
-              <w:top w:w="120" w:type="dxa"/>
-              <w:bottom w:w="120" w:type="dxa"/>
-              <w:start w:w="0" w:type="dxa"/>
-              <w:end w:w="216" w:type="dxa"/>
+              <w:top w:w="170" w:type="dxa"/>
+              <w:bottom w:w="90" w:type="dxa"/>
+              <w:start w:w="170" w:type="dxa"/>
+              <w:end w:w="50" w:type="dxa"/>
             </w:tcMar>
             <w:tcBorders>
-              <w:right w:val="single" w:sz="4" w:space="0" w:color="DDE5E0"/>
-              <w:bottom w:val="single" w:sz="4" w:space="0" w:color="DDE5E0"/>
+              <w:right w:val="nil" w:sz="4" w:space="0" w:color="DDE5E0"/>
+              <w:bottom w:val="single" w:sz="16" w:space="0" w:color="FFFFFF"/>
+              <w:end w:val="nil"/>
+              <w:top w:val="single" w:sz="16" w:space="0" w:color="FFFFFF"/>
             </w:tcBorders>
           </w:tcPr>
           <w:p>
             <w:pPr>
-              <w:pStyle w:val="SessionNumber"/>
+              <w:pStyle w:val="AgendaTime"/>
+              <w:jc w:val="left"/>
+              <w:ind w:left="0" w:right="0" w:firstLine="0" w:hanging="0"/>
+              <w:spacing w:before="0" w:after="0"/>
             </w:pPr>
             <w:r>
               <w:rPr>
-                <w:spacing w:val="3"/>
+                <w:rFonts w:ascii="Arial" w:hAnsi="Arial" w:cs="Arial"/>
+                <w:b w:val="1"/>
+                <w:bCs w:val="1"/>
+                <w:color w:val="142019"/>
+                <w:sz w:val="26"/>
+                <w:szCs w:val="26"/>
               </w:rPr>
-              <w:t>0</w:t>
+              <w:t>1</w:t>
             </w:r>
-          </w:p>
-          <w:p>
-            <w:pPr>
-              <w:pStyle w:val="AgendaTime"/>
-            </w:pPr>
             <w:r>
-              <w:t>1</w:t>
+              <w:br/>
+            </w:r>
+            <w:r>
+              <w:rPr>
+                <w:rFonts w:ascii="Arial" w:hAnsi="Arial" w:cs="Arial"/>
+                <w:b w:val="1"/>
+                <w:bCs w:val="1"/>
+                <w:color w:val="657169"/>
+                <w:sz w:val="13"/>
+                <w:szCs w:val="13"/>
+                <w:spacing w:val="4"/>
+              </w:rPr>
+              <w:t/>
+            </w:r>
+            <w:r>
+              <w:rPr>
+                <w:rFonts w:ascii="Arial" w:hAnsi="Arial" w:cs="Arial"/>
+                <w:b w:val="0"/>
+                <w:bCs w:val="0"/>
+                <w:color w:val="8A948E"/>
+                <w:sz w:val="13"/>
+                <w:szCs w:val="13"/>
+              </w:rPr>
+              <w:t xml:space="preserve"/>
+            </w:r>
+            <w:r>
+              <w:rPr>
+                <w:rFonts w:ascii="Arial" w:hAnsi="Arial" w:cs="Arial"/>
+                <w:b w:val="1"/>
+                <w:bCs w:val="1"/>
+                <w:color w:val="016F3B"/>
+                <w:sz w:val="13"/>
+                <w:szCs w:val="13"/>
+                <w:spacing w:val="4"/>
+              </w:rPr>
+              <w:t/>
             </w:r>
           </w:p>
         </w:tc>
         <w:tc>
           <w:tcPr>
-            <w:tcW w:type="dxa" w:w="7560"/>
-            <w:vAlign w:val="center"/>
+            <w:tcW w:type="dxa" w:w="7848"/>
+            <w:vAlign w:val="top"/>
             <w:shd w:val="clear" w:color="auto" w:fill="FFFFFF"/>
             <w:tcMar>
-              <w:top w:w="120" w:type="dxa"/>
-              <w:bottom w:w="120" w:type="dxa"/>
+              <w:top w:w="170" w:type="dxa"/>
+              <w:bottom w:w="90" w:type="dxa"/>
               <w:start w:w="216" w:type="dxa"/>
               <w:end w:w="216" w:type="dxa"/>
             </w:tcMar>
             <w:tcBorders>
-              <w:bottom w:val="single" w:sz="4" w:space="0" w:color="DDE5E0"/>
+              <w:bottom w:val="nil" w:sz="4" w:space="0" w:color="DDE5E0"/>
+              <w:left w:val="nil"/>
+              <w:start w:val="nil"/>
+              <w:top w:val="nil"/>
             </w:tcBorders>
           </w:tcPr>
           <w:p>
@@ -780,72 +1017,112 @@
       <w:tr>
         <w:trPr>
           <w:cantSplit/>
-          <w:trHeight w:val="480" w:hRule="atLeast"/>
+          <w:trHeight w:val="400" w:hRule="atLeast"/>
         </w:trPr>
         <w:tc>
           <w:tcPr>
-            <w:tcW w:type="dxa" w:w="1800"/>
+            <w:tcW w:type="dxa" w:w="1512"/>
             <w:vAlign w:val="center"/>
             <w:shd w:val="clear" w:color="auto" w:fill="F2F7F4"/>
             <w:tcMar>
-              <w:top w:w="80" w:type="dxa"/>
-              <w:bottom w:w="80" w:type="dxa"/>
-              <w:start w:w="0" w:type="dxa"/>
-              <w:end w:w="216" w:type="dxa"/>
+              <w:top w:w="55" w:type="dxa"/>
+              <w:bottom w:w="55" w:type="dxa"/>
+              <w:start w:w="170" w:type="dxa"/>
+              <w:end w:w="50" w:type="dxa"/>
             </w:tcMar>
             <w:tcBorders>
-              <w:top w:val="single" w:sz="4" w:space="0" w:color="D7E4DC"/>
-              <w:bottom w:val="single" w:sz="4" w:space="0" w:color="D7E4DC"/>
+              <w:top w:val="single" w:sz="8" w:space="0" w:color="FFFFFF"/>
+              <w:bottom w:val="single" w:sz="8" w:space="0" w:color="FFFFFF"/>
+              <w:right w:val="nil"/>
+              <w:end w:val="nil"/>
             </w:tcBorders>
           </w:tcPr>
           <w:p>
             <w:pPr>
               <w:pStyle w:val="AgendaBreakTime"/>
-              <w:jc w:val="right"/>
+              <w:jc w:val="left"/>
+              <w:ind w:left="0" w:right="0" w:firstLine="0" w:hanging="0"/>
+              <w:spacing w:before="0" w:after="0"/>
             </w:pPr>
             <w:r>
+              <w:rPr>
+                <w:rFonts w:ascii="Arial" w:hAnsi="Arial" w:cs="Arial"/>
+                <w:b w:val="1"/>
+                <w:bCs w:val="1"/>
+                <w:color w:val="46534B"/>
+                <w:sz w:val="17"/>
+                <w:szCs w:val="17"/>
+              </w:rPr>
               <w:t>1</w:t>
+            </w:r>
+            <w:r>
+              <w:rPr>
+                <w:rFonts w:ascii="Arial" w:hAnsi="Arial" w:cs="Arial"/>
+                <w:b w:val="0"/>
+                <w:bCs w:val="0"/>
+                <w:color w:val="657169"/>
+                <w:sz w:val="14"/>
+                <w:szCs w:val="14"/>
+                <w:spacing w:val="3"/>
+              </w:rPr>
+              <w:t xml:space="preserve"/>
             </w:r>
           </w:p>
         </w:tc>
         <w:tc>
           <w:tcPr>
-            <w:tcW w:type="dxa" w:w="7560"/>
+            <w:tcW w:type="dxa" w:w="7848"/>
             <w:vAlign w:val="center"/>
             <w:shd w:val="clear" w:color="auto" w:fill="F2F7F4"/>
             <w:tcMar>
-              <w:top w:w="80" w:type="dxa"/>
-              <w:bottom w:w="80" w:type="dxa"/>
+              <w:top w:w="55" w:type="dxa"/>
+              <w:bottom w:w="55" w:type="dxa"/>
               <w:start w:w="216" w:type="dxa"/>
               <w:end w:w="216" w:type="dxa"/>
             </w:tcMar>
             <w:tcBorders>
-              <w:top w:val="single" w:sz="4" w:space="0" w:color="016F3B"/>
-              <w:bottom w:val="single" w:sz="4" w:space="0" w:color="D7E4DC"/>
+              <w:top w:val="single" w:sz="8" w:space="0" w:color="FFFFFF"/>
+              <w:bottom w:val="single" w:sz="8" w:space="0" w:color="FFFFFF"/>
+              <w:left w:val="nil"/>
+              <w:start w:val="nil"/>
             </w:tcBorders>
           </w:tcPr>
           <w:p>
             <w:pPr>
               <w:pStyle w:val="BreakLabel"/>
               <w:jc w:val="left"/>
+              <w:ind w:left="0" w:right="0" w:firstLine="0" w:hanging="0"/>
+              <w:spacing w:before="0" w:after="0"/>
+              <w:tabs>
+                <w:tab w:val="right" w:pos="7420"/>
+              </w:tabs>
             </w:pPr>
             <w:r>
               <w:rPr>
-                <w:rFonts w:ascii="Arial" w:hAnsi="Arial" w:eastAsia="Arial" w:cs="Arial"/>
-                <w:b/>
+                <w:rFonts w:ascii="Arial" w:hAnsi="Arial" w:cs="Arial"/>
+                <w:b w:val="1"/>
+                <w:bCs w:val="1"/>
                 <w:color w:val="016F3B"/>
                 <w:sz w:val="16"/>
+                <w:szCs w:val="16"/>
+                <w:spacing w:val="2"/>
               </w:rPr>
               <w:t>C</w:t>
             </w:r>
             <w:r>
+              <w:tab/>
+            </w:r>
+            <w:r>
               <w:rPr>
-                <w:rFonts w:ascii="Arial" w:hAnsi="Arial" w:eastAsia="Arial" w:cs="Arial"/>
+                <w:rFonts w:ascii="Arial" w:hAnsi="Arial" w:cs="Arial"/>
                 <w:b w:val="0"/>
+                <w:bCs w:val="0"/>
                 <w:color w:val="657169"/>
                 <w:sz w:val="15"/>
+                <w:szCs w:val="15"/>
+                <w:spacing w:val="4"/>
               </w:rPr>
-              <w:t xml:space="preserve"/>
+              <w:t/>
             </w:r>
           </w:p>
         </w:tc>
@@ -853,57 +1130,100 @@
       <w:tr>
         <w:trPr>
           <w:cantSplit/>
-          <w:trHeight w:val="1425" w:hRule="atLeast"/>
+          <w:trHeight w:val="1240" w:hRule="atLeast"/>
         </w:trPr>
         <w:tc>
           <w:tcPr>
-            <w:tcW w:type="dxa" w:w="1800"/>
-            <w:vAlign w:val="center"/>
-            <w:shd w:val="clear" w:color="auto" w:fill="EEF5F1"/>
+            <w:tcW w:type="dxa" w:w="1512"/>
+            <w:vAlign w:val="top"/>
+            <w:shd w:val="clear" w:color="auto" w:fill="EAF2ED"/>
             <w:tcMar>
-              <w:top w:w="120" w:type="dxa"/>
-              <w:bottom w:w="120" w:type="dxa"/>
-              <w:start w:w="0" w:type="dxa"/>
-              <w:end w:w="216" w:type="dxa"/>
+              <w:top w:w="170" w:type="dxa"/>
+              <w:bottom w:w="90" w:type="dxa"/>
+              <w:start w:w="170" w:type="dxa"/>
+              <w:end w:w="50" w:type="dxa"/>
             </w:tcMar>
             <w:tcBorders>
-              <w:right w:val="single" w:sz="4" w:space="0" w:color="DDE5E0"/>
-              <w:bottom w:val="single" w:sz="4" w:space="0" w:color="DDE5E0"/>
+              <w:right w:val="nil" w:sz="4" w:space="0" w:color="DDE5E0"/>
+              <w:bottom w:val="single" w:sz="16" w:space="0" w:color="FFFFFF"/>
+              <w:end w:val="nil"/>
+              <w:top w:val="single" w:sz="16" w:space="0" w:color="FFFFFF"/>
             </w:tcBorders>
           </w:tcPr>
           <w:p>
             <w:pPr>
-              <w:pStyle w:val="SessionNumber"/>
+              <w:pStyle w:val="AgendaTime"/>
+              <w:jc w:val="left"/>
+              <w:ind w:left="0" w:right="0" w:firstLine="0" w:hanging="0"/>
+              <w:spacing w:before="0" w:after="0"/>
             </w:pPr>
             <w:r>
               <w:rPr>
-                <w:spacing w:val="3"/>
+                <w:rFonts w:ascii="Arial" w:hAnsi="Arial" w:cs="Arial"/>
+                <w:b w:val="1"/>
+                <w:bCs w:val="1"/>
+                <w:color w:val="142019"/>
+                <w:sz w:val="26"/>
+                <w:szCs w:val="26"/>
               </w:rPr>
-              <w:t>0</w:t>
+              <w:t>1</w:t>
             </w:r>
-          </w:p>
-          <w:p>
-            <w:pPr>
-              <w:pStyle w:val="AgendaTime"/>
-            </w:pPr>
             <w:r>
-              <w:t>1</w:t>
+              <w:br/>
+            </w:r>
+            <w:r>
+              <w:rPr>
+                <w:rFonts w:ascii="Arial" w:hAnsi="Arial" w:cs="Arial"/>
+                <w:b w:val="1"/>
+                <w:bCs w:val="1"/>
+                <w:color w:val="657169"/>
+                <w:sz w:val="13"/>
+                <w:szCs w:val="13"/>
+                <w:spacing w:val="4"/>
+              </w:rPr>
+              <w:t/>
+            </w:r>
+            <w:r>
+              <w:rPr>
+                <w:rFonts w:ascii="Arial" w:hAnsi="Arial" w:cs="Arial"/>
+                <w:b w:val="0"/>
+                <w:bCs w:val="0"/>
+                <w:color w:val="8A948E"/>
+                <w:sz w:val="13"/>
+                <w:szCs w:val="13"/>
+              </w:rPr>
+              <w:t xml:space="preserve"/>
+            </w:r>
+            <w:r>
+              <w:rPr>
+                <w:rFonts w:ascii="Arial" w:hAnsi="Arial" w:cs="Arial"/>
+                <w:b w:val="1"/>
+                <w:bCs w:val="1"/>
+                <w:color w:val="016F3B"/>
+                <w:sz w:val="13"/>
+                <w:szCs w:val="13"/>
+                <w:spacing w:val="4"/>
+              </w:rPr>
+              <w:t/>
             </w:r>
           </w:p>
         </w:tc>
         <w:tc>
           <w:tcPr>
-            <w:tcW w:type="dxa" w:w="7560"/>
-            <w:vAlign w:val="center"/>
+            <w:tcW w:type="dxa" w:w="7848"/>
+            <w:vAlign w:val="top"/>
             <w:shd w:val="clear" w:color="auto" w:fill="FFFFFF"/>
             <w:tcMar>
-              <w:top w:w="120" w:type="dxa"/>
-              <w:bottom w:w="120" w:type="dxa"/>
+              <w:top w:w="170" w:type="dxa"/>
+              <w:bottom w:w="90" w:type="dxa"/>
               <w:start w:w="216" w:type="dxa"/>
               <w:end w:w="216" w:type="dxa"/>
             </w:tcMar>
             <w:tcBorders>
-              <w:bottom w:val="single" w:sz="4" w:space="0" w:color="DDE5E0"/>
+              <w:bottom w:val="nil" w:sz="4" w:space="0" w:color="DDE5E0"/>
+              <w:left w:val="nil"/>
+              <w:start w:val="nil"/>
+              <w:top w:val="nil"/>
             </w:tcBorders>
           </w:tcPr>
           <w:p>
@@ -927,57 +1247,100 @@
       <w:tr>
         <w:trPr>
           <w:cantSplit/>
-          <w:trHeight w:val="1425" w:hRule="atLeast"/>
+          <w:trHeight w:val="1240" w:hRule="atLeast"/>
         </w:trPr>
         <w:tc>
           <w:tcPr>
-            <w:tcW w:type="dxa" w:w="1800"/>
-            <w:vAlign w:val="center"/>
-            <w:shd w:val="clear" w:color="auto" w:fill="EEF5F1"/>
+            <w:tcW w:type="dxa" w:w="1512"/>
+            <w:vAlign w:val="top"/>
+            <w:shd w:val="clear" w:color="auto" w:fill="EAF2ED"/>
             <w:tcMar>
-              <w:top w:w="120" w:type="dxa"/>
-              <w:bottom w:w="120" w:type="dxa"/>
-              <w:start w:w="0" w:type="dxa"/>
-              <w:end w:w="216" w:type="dxa"/>
+              <w:top w:w="170" w:type="dxa"/>
+              <w:bottom w:w="90" w:type="dxa"/>
+              <w:start w:w="170" w:type="dxa"/>
+              <w:end w:w="50" w:type="dxa"/>
             </w:tcMar>
             <w:tcBorders>
-              <w:right w:val="single" w:sz="4" w:space="0" w:color="DDE5E0"/>
-              <w:bottom w:val="single" w:sz="4" w:space="0" w:color="DDE5E0"/>
+              <w:right w:val="nil" w:sz="4" w:space="0" w:color="DDE5E0"/>
+              <w:bottom w:val="single" w:sz="4" w:space="0" w:color="D5DED9"/>
+              <w:end w:val="nil"/>
+              <w:top w:val="single" w:sz="16" w:space="0" w:color="FFFFFF"/>
             </w:tcBorders>
           </w:tcPr>
           <w:p>
             <w:pPr>
-              <w:pStyle w:val="SessionNumber"/>
+              <w:pStyle w:val="AgendaTime"/>
+              <w:jc w:val="left"/>
+              <w:ind w:left="0" w:right="0" w:firstLine="0" w:hanging="0"/>
+              <w:spacing w:before="0" w:after="0"/>
             </w:pPr>
             <w:r>
               <w:rPr>
-                <w:spacing w:val="3"/>
+                <w:rFonts w:ascii="Arial" w:hAnsi="Arial" w:cs="Arial"/>
+                <w:b w:val="1"/>
+                <w:bCs w:val="1"/>
+                <w:color w:val="142019"/>
+                <w:sz w:val="26"/>
+                <w:szCs w:val="26"/>
               </w:rPr>
-              <w:t>0</w:t>
+              <w:t>1</w:t>
             </w:r>
-          </w:p>
-          <w:p>
-            <w:pPr>
-              <w:pStyle w:val="AgendaTime"/>
-            </w:pPr>
             <w:r>
-              <w:t>1</w:t>
+              <w:br/>
+            </w:r>
+            <w:r>
+              <w:rPr>
+                <w:rFonts w:ascii="Arial" w:hAnsi="Arial" w:cs="Arial"/>
+                <w:b w:val="1"/>
+                <w:bCs w:val="1"/>
+                <w:color w:val="657169"/>
+                <w:sz w:val="13"/>
+                <w:szCs w:val="13"/>
+                <w:spacing w:val="4"/>
+              </w:rPr>
+              <w:t/>
+            </w:r>
+            <w:r>
+              <w:rPr>
+                <w:rFonts w:ascii="Arial" w:hAnsi="Arial" w:cs="Arial"/>
+                <w:b w:val="0"/>
+                <w:bCs w:val="0"/>
+                <w:color w:val="8A948E"/>
+                <w:sz w:val="13"/>
+                <w:szCs w:val="13"/>
+              </w:rPr>
+              <w:t xml:space="preserve"/>
+            </w:r>
+            <w:r>
+              <w:rPr>
+                <w:rFonts w:ascii="Arial" w:hAnsi="Arial" w:cs="Arial"/>
+                <w:b w:val="1"/>
+                <w:bCs w:val="1"/>
+                <w:color w:val="016F3B"/>
+                <w:sz w:val="13"/>
+                <w:szCs w:val="13"/>
+                <w:spacing w:val="4"/>
+              </w:rPr>
+              <w:t/>
             </w:r>
           </w:p>
         </w:tc>
         <w:tc>
           <w:tcPr>
-            <w:tcW w:type="dxa" w:w="7560"/>
-            <w:vAlign w:val="center"/>
+            <w:tcW w:type="dxa" w:w="7848"/>
+            <w:vAlign w:val="top"/>
             <w:shd w:val="clear" w:color="auto" w:fill="FFFFFF"/>
             <w:tcMar>
-              <w:top w:w="120" w:type="dxa"/>
-              <w:bottom w:w="120" w:type="dxa"/>
+              <w:top w:w="170" w:type="dxa"/>
+              <w:bottom w:w="90" w:type="dxa"/>
               <w:start w:w="216" w:type="dxa"/>
               <w:end w:w="216" w:type="dxa"/>
             </w:tcMar>
             <w:tcBorders>
-              <w:bottom w:val="single" w:sz="4" w:space="0" w:color="DDE5E0"/>
+              <w:bottom w:val="single" w:sz="4" w:space="0" w:color="D5DED9"/>
+              <w:left w:val="nil"/>
+              <w:start w:val="nil"/>
+              <w:top w:val="nil"/>
             </w:tcBorders>
           </w:tcPr>
           <w:p>
@@ -13071,7 +13434,7 @@
     <w:pPr>
       <w:keepNext/>
       <w:keepLines/>
-      <w:spacing w:before="0" w:after="200" w:line="240" w:lineRule="auto"/>
+      <w:spacing w:before="0" w:after="0" w:line="240" w:lineRule="auto"/>
       <w:jc w:val="left"/>
     </w:pPr>
     <w:rPr>
@@ -13079,6 +13442,7 @@
       <w:b/>
       <w:color w:val="016F3B"/>
       <w:sz w:val="15"/>
+      <w:szCs w:val="15"/>
     </w:rPr>
   </w:style>
   <w:style w:type="paragraph" w:customStyle="1" w:styleId="CRALogo">
@@ -13103,14 +13467,16 @@
     <w:pPr>
       <w:keepNext/>
       <w:keepLines/>
-      <w:spacing w:before="0" w:after="100" w:line="540" w:lineRule="exact"/>
+      <w:spacing w:before="0" w:after="55" w:line="540" w:lineRule="exact"/>
       <w:jc w:val="left"/>
     </w:pPr>
     <w:rPr>
       <w:rFonts w:ascii="Arial" w:hAnsi="Arial" w:eastAsia="Arial" w:cs="Arial"/>
       <w:b/>
       <w:color w:val="142019"/>
-      <w:sz w:val="53"/>
+      <w:sz w:val="52"/>
+      <w:szCs w:val="52"/>
+      <w:spacing w:val="-2"/>
     </w:rPr>
   </w:style>
   <w:style w:type="paragraph" w:customStyle="1" w:styleId="CRASubtitle">
@@ -13127,6 +13493,7 @@
       <w:b w:val="0"/>
       <w:color w:val="657169"/>
       <w:sz w:val="19"/>
+      <w:szCs w:val="19"/>
     </w:rPr>
   </w:style>
   <w:style w:type="paragraph" w:customStyle="1" w:styleId="CRAMetadataLabel">
@@ -13183,6 +13550,24 @@
     <w:pPr>
       <w:keepNext w:val="0"/>
       <w:keepLines/>
+      <w:spacing w:before="15" w:after="0" w:line="240" w:lineRule="auto"/>
+      <w:jc w:val="right"/>
+    </w:pPr>
+    <w:rPr>
+      <w:rFonts w:ascii="Arial" w:hAnsi="Arial" w:eastAsia="Arial" w:cs="Arial"/>
+      <w:b w:val="0"/>
+      <w:color w:val="56635B"/>
+      <w:sz w:val="18"/>
+      <w:szCs w:val="18"/>
+      <w:bCs w:val="0"/>
+    </w:rPr>
+  </w:style>
+  <w:style w:type="paragraph" w:customStyle="1" w:styleId="AgendaBreakTime">
+    <w:name w:val="Agenda Break Time"/>
+    <w:basedOn w:val="Normal"/>
+    <w:pPr>
+      <w:keepNext w:val="0"/>
+      <w:keepLines/>
       <w:spacing w:before="0" w:after="0" w:line="240" w:lineRule="auto"/>
       <w:jc w:val="right"/>
     </w:pPr>
@@ -13191,22 +13576,8 @@
       <w:b w:val="0"/>
       <w:color w:val="657169"/>
       <w:sz w:val="17"/>
-    </w:rPr>
-  </w:style>
-  <w:style w:type="paragraph" w:customStyle="1" w:styleId="AgendaBreakTime">
-    <w:name w:val="Agenda Break Time"/>
-    <w:basedOn w:val="Normal"/>
-    <w:pPr>
-      <w:keepNext w:val="0"/>
-      <w:keepLines/>
-      <w:spacing w:before="0" w:after="0" w:line="240" w:lineRule="auto"/>
-      <w:jc w:val="right"/>
-    </w:pPr>
-    <w:rPr>
-      <w:rFonts w:ascii="Arial" w:hAnsi="Arial" w:eastAsia="Arial" w:cs="Arial"/>
-      <w:b w:val="0"/>
-      <w:color w:val="657169"/>
-      <w:sz w:val="16"/>
+      <w:szCs w:val="17"/>
+      <w:bCs w:val="0"/>
     </w:rPr>
   </w:style>
   <w:style w:type="paragraph" w:customStyle="1" w:styleId="SessionNumber">
@@ -13231,14 +13602,15 @@
     <w:pPr>
       <w:keepNext/>
       <w:keepLines/>
-      <w:spacing w:before="0" w:after="60" w:line="240" w:lineRule="auto"/>
+      <w:spacing w:before="0" w:after="70" w:line="240" w:lineRule="auto"/>
       <w:jc w:val="left"/>
     </w:pPr>
     <w:rPr>
       <w:rFonts w:ascii="Arial" w:hAnsi="Arial" w:eastAsia="Arial" w:cs="Arial"/>
       <w:b/>
-      <w:color w:val="142019"/>
+      <w:color w:val="18231D"/>
       <w:sz w:val="21"/>
+      <w:szCs w:val="21"/>
     </w:rPr>
   </w:style>
   <w:style w:type="paragraph" w:customStyle="1" w:styleId="SessionDescription">
@@ -13255,6 +13627,7 @@
       <w:b w:val="0"/>
       <w:color w:val="455149"/>
       <w:sz w:val="18"/>
+      <w:szCs w:val="18"/>
     </w:rPr>
   </w:style>
   <w:style w:type="paragraph" w:customStyle="1" w:styleId="BreakLabel">
@@ -13271,6 +13644,7 @@
       <w:b w:val="0"/>
       <w:color w:val="016F3B"/>
       <w:sz w:val="16"/>
+      <w:szCs w:val="16"/>
     </w:rPr>
   </w:style>
 </w:styles>

</xml_diff>

<commit_message>
Update Word agenda template (#488)
Co-authored-by: Mike Berry <mikeberry6@mikes-mac-mini.tailbfd1cf.ts.net>
</commit_message>
<xml_diff>
--- a/public/one-off-requests/word-format.docx
+++ b/public/one-off-requests/word-format.docx
@@ -26,14 +26,15 @@
       <w:tr>
         <w:trPr>
           <w:cantSplit/>
+          <w:trHeight w:val="480" w:hRule="atLeast"/>
         </w:trPr>
         <w:tc>
           <w:tcPr>
             <w:tcW w:type="dxa" w:w="6984"/>
             <w:vAlign w:val="top"/>
             <w:tcMar>
-              <w:top w:w="130" w:type="dxa"/>
-              <w:bottom w:w="100" w:type="dxa"/>
+              <w:top w:w="90" w:type="dxa"/>
+              <w:bottom w:w="25" w:type="dxa"/>
               <w:start w:w="0" w:type="dxa"/>
               <w:end w:w="0" w:type="dxa"/>
             </w:tcMar>
@@ -49,34 +50,14 @@
               <w:t>C</w:t>
             </w:r>
           </w:p>
-          <w:p>
-            <w:pPr>
-              <w:pStyle w:val="CRAEditorialTitle"/>
-            </w:pPr>
-            <w:r>
-              <w:t>S</w:t>
-            </w:r>
-            <w:r>
-              <w:t/>
-            </w:r>
-          </w:p>
-          <w:p>
-            <w:pPr>
-              <w:pStyle w:val="CRASubtitle"/>
-              <w:spacing w:after="0"/>
-            </w:pPr>
-            <w:r>
-              <w:t>I</w:t>
-            </w:r>
-          </w:p>
         </w:tc>
         <w:tc>
           <w:tcPr>
             <w:tcW w:type="dxa" w:w="432"/>
             <w:vAlign w:val="top"/>
             <w:tcMar>
-              <w:top w:w="130" w:type="dxa"/>
-              <w:bottom w:w="100" w:type="dxa"/>
+              <w:top w:w="90" w:type="dxa"/>
+              <w:bottom w:w="25" w:type="dxa"/>
               <w:start w:w="0" w:type="dxa"/>
               <w:end w:w="0" w:type="dxa"/>
             </w:tcMar>
@@ -97,8 +78,8 @@
             <w:tcW w:type="dxa" w:w="1944"/>
             <w:vAlign w:val="top"/>
             <w:tcMar>
-              <w:top w:w="130" w:type="dxa"/>
-              <w:bottom w:w="100" w:type="dxa"/>
+              <w:top w:w="125" w:type="dxa"/>
+              <w:bottom w:w="0" w:type="dxa"/>
               <w:start w:w="0" w:type="dxa"/>
               <w:end w:w="0" w:type="dxa"/>
             </w:tcMar>
@@ -106,8 +87,47 @@
           </w:tcPr>
           <w:p>
             <w:pPr>
-              <w:spacing w:before="0" w:after="0" w:line="20" w:lineRule="exact"/>
+              <w:pStyle w:val="CRALogo"/>
             </w:pPr>
+            <w:r/>
+          </w:p>
+        </w:tc>
+      </w:tr>
+      <w:tr>
+        <w:trPr>
+          <w:cantSplit/>
+        </w:trPr>
+        <w:tc>
+          <w:tcPr>
+            <w:tcW w:type="dxa" w:w="9360"/>
+            <w:gridSpan w:val="3"/>
+            <w:tcMar>
+              <w:top w:w="35" w:type="dxa"/>
+              <w:start w:w="0" w:type="dxa"/>
+              <w:bottom w:w="110" w:type="dxa"/>
+              <w:end w:w="0" w:type="dxa"/>
+            </w:tcMar>
+            <w:vAlign w:val="top"/>
+          </w:tcPr>
+          <w:p>
+            <w:pPr>
+              <w:pStyle w:val="CRAEditorialTitle"/>
+            </w:pPr>
+            <w:r>
+              <w:t>S</w:t>
+            </w:r>
+            <w:r>
+              <w:t/>
+            </w:r>
+          </w:p>
+          <w:p>
+            <w:pPr>
+              <w:pStyle w:val="CRASubtitle"/>
+              <w:spacing w:after="0"/>
+            </w:pPr>
+            <w:r>
+              <w:t xml:space="preserve">I</w:t>
+            </w:r>
           </w:p>
         </w:tc>
       </w:tr>
@@ -119,6 +139,9 @@
         <w:tblLook w:firstColumn="1" w:firstRow="1" w:lastColumn="0" w:lastRow="0" w:noHBand="0" w:noVBand="1" w:val="04A0"/>
         <w:tblInd w:type="dxa" w:w="0"/>
         <w:jc w:val="left"/>
+        <w:tblBorders>
+          <w:insideV w:val="nil"/>
+        </w:tblBorders>
       </w:tblPr>
       <w:tblGrid>
         <w:gridCol w:w="2950"/>
@@ -127,24 +150,27 @@
       </w:tblGrid>
       <w:tr>
         <w:trPr>
-          <w:trHeight w:val="480" w:hRule="atLeast"/>
+          <w:trHeight w:val="420" w:hRule="atLeast"/>
           <w:cantSplit/>
         </w:trPr>
         <w:tc>
           <w:tcPr>
             <w:tcW w:type="dxa" w:w="2950"/>
             <w:vAlign w:val="center"/>
-            <w:shd w:val="clear" w:color="auto" w:fill="EDF5F0"/>
+            <w:shd w:val="clear" w:color="auto" w:fill="F5F8F6"/>
             <w:tcMar>
-              <w:top w:w="70" w:type="dxa"/>
-              <w:bottom w:w="80" w:type="dxa"/>
+              <w:top w:w="55" w:type="dxa"/>
+              <w:bottom w:w="60" w:type="dxa"/>
               <w:start w:w="180" w:type="dxa"/>
               <w:end w:w="175" w:type="dxa"/>
             </w:tcMar>
             <w:tcBorders>
               <w:top w:val="single" w:sz="8" w:space="0" w:color="016F3B"/>
               <w:bottom w:val="single" w:sz="4" w:space="0" w:color="D7E4DC"/>
-              <w:right w:val="single" w:sz="4" w:space="0" w:color="D7E4DC"/>
+              <w:right w:val="nil" w:sz="4" w:space="0" w:color="D7E4DC"/>
+              <w:start w:val="nil"/>
+              <w:end w:val="nil"/>
+              <w:left w:val="nil"/>
             </w:tcBorders>
           </w:tcPr>
           <w:p>
@@ -175,7 +201,9 @@
                 <w:rFonts w:ascii="Arial" w:hAnsi="Arial" w:eastAsia="Arial" w:cs="Arial"/>
                 <w:b w:val="0"/>
                 <w:color w:val="142019"/>
-                <w:sz w:val="18"/>
+                <w:sz w:val="17"/>
+                <w:bCs w:val="0"/>
+                <w:szCs w:val="17"/>
               </w:rPr>
               <w:t>A</w:t>
             </w:r>
@@ -185,17 +213,20 @@
           <w:tcPr>
             <w:tcW w:type="dxa" w:w="3100"/>
             <w:vAlign w:val="center"/>
-            <w:shd w:val="clear" w:color="auto" w:fill="EDF5F0"/>
+            <w:shd w:val="clear" w:color="auto" w:fill="F5F8F6"/>
             <w:tcMar>
-              <w:top w:w="70" w:type="dxa"/>
-              <w:bottom w:w="80" w:type="dxa"/>
+              <w:top w:w="55" w:type="dxa"/>
+              <w:bottom w:w="60" w:type="dxa"/>
               <w:start w:w="180" w:type="dxa"/>
               <w:end w:w="175" w:type="dxa"/>
             </w:tcMar>
             <w:tcBorders>
               <w:top w:val="single" w:sz="8" w:space="0" w:color="016F3B"/>
               <w:bottom w:val="single" w:sz="4" w:space="0" w:color="D7E4DC"/>
-              <w:right w:val="single" w:sz="4" w:space="0" w:color="D7E4DC"/>
+              <w:right w:val="nil" w:sz="4" w:space="0" w:color="D7E4DC"/>
+              <w:start w:val="nil"/>
+              <w:end w:val="nil"/>
+              <w:left w:val="nil"/>
             </w:tcBorders>
           </w:tcPr>
           <w:p>
@@ -224,9 +255,11 @@
             <w:r>
               <w:rPr>
                 <w:rFonts w:ascii="Arial" w:hAnsi="Arial" w:eastAsia="Arial" w:cs="Arial"/>
-                <w:b/>
+                <w:b w:val="0"/>
                 <w:color w:val="142019"/>
-                <w:sz w:val="18"/>
+                <w:sz w:val="17"/>
+                <w:bCs w:val="0"/>
+                <w:szCs w:val="17"/>
               </w:rPr>
               <w:t>8</w:t>
             </w:r>
@@ -236,16 +269,20 @@
           <w:tcPr>
             <w:tcW w:type="dxa" w:w="3310"/>
             <w:vAlign w:val="center"/>
-            <w:shd w:val="clear" w:color="auto" w:fill="EDF5F0"/>
+            <w:shd w:val="clear" w:color="auto" w:fill="F5F8F6"/>
             <w:tcMar>
-              <w:top w:w="70" w:type="dxa"/>
-              <w:bottom w:w="80" w:type="dxa"/>
+              <w:top w:w="55" w:type="dxa"/>
+              <w:bottom w:w="60" w:type="dxa"/>
               <w:start w:w="180" w:type="dxa"/>
               <w:end w:w="175" w:type="dxa"/>
             </w:tcMar>
             <w:tcBorders>
               <w:top w:val="single" w:sz="8" w:space="0" w:color="016F3B"/>
               <w:bottom w:val="single" w:sz="4" w:space="0" w:color="D7E4DC"/>
+              <w:start w:val="nil"/>
+              <w:end w:val="nil"/>
+              <w:left w:val="nil"/>
+              <w:right w:val="nil"/>
             </w:tcBorders>
           </w:tcPr>
           <w:p>
@@ -276,7 +313,9 @@
                 <w:rFonts w:ascii="Arial" w:hAnsi="Arial" w:eastAsia="Arial" w:cs="Arial"/>
                 <w:b w:val="0"/>
                 <w:color w:val="142019"/>
-                <w:sz w:val="18"/>
+                <w:sz w:val="17"/>
+                <w:bCs w:val="0"/>
+                <w:szCs w:val="17"/>
               </w:rPr>
               <w:t>C</w:t>
             </w:r>
@@ -316,24 +355,34 @@
         <w:tblInd w:type="dxa" w:w="0"/>
       </w:tblPr>
       <w:tblGrid>
-        <w:gridCol w:w="1800"/>
-        <w:gridCol w:w="7560"/>
+        <w:gridCol w:w="1512"/>
+        <w:gridCol w:w="7848"/>
       </w:tblGrid>
       <w:tr>
         <w:trPr>
           <w:cantSplit/>
-          <w:trHeight w:val="180" w:hRule="atLeast"/>
+          <w:trHeight w:val="230" w:hRule="atLeast"/>
         </w:trPr>
         <w:tc>
           <w:tcPr>
-            <w:tcW w:type="dxa" w:w="1800"/>
+            <w:tcW w:type="dxa" w:w="9360"/>
             <w:vAlign w:val="bottom"/>
             <w:tcMar>
-              <w:top w:w="0" w:type="dxa"/>
-              <w:bottom w:w="0" w:type="dxa"/>
+              <w:top w:w="45" w:type="dxa"/>
+              <w:bottom w:w="60" w:type="dxa"/>
               <w:start w:w="0" w:type="dxa"/>
               <w:end w:w="0" w:type="dxa"/>
             </w:tcMar>
+            <w:gridSpan w:val="2"/>
+            <w:shd w:val="clear" w:color="auto" w:fill="FFFFFF"/>
+            <w:tcBorders>
+              <w:top w:val="nil"/>
+              <w:start w:val="nil"/>
+              <w:end w:val="nil"/>
+              <w:left w:val="nil"/>
+              <w:right w:val="nil"/>
+              <w:bottom w:val="single" w:sz="4" w:space="0" w:color="DFE6E2"/>
+            </w:tcBorders>
           </w:tcPr>
           <w:p>
             <w:pPr>
@@ -344,30 +393,6 @@
                 <w:spacing w:val="10"/>
               </w:rPr>
               <w:t>A</w:t>
-            </w:r>
-          </w:p>
-        </w:tc>
-        <w:tc>
-          <w:tcPr>
-            <w:tcW w:type="dxa" w:w="7560"/>
-            <w:vAlign w:val="bottom"/>
-            <w:tcMar>
-              <w:top w:w="0" w:type="dxa"/>
-              <w:bottom w:w="0" w:type="dxa"/>
-              <w:start w:w="0" w:type="dxa"/>
-              <w:end w:w="0" w:type="dxa"/>
-            </w:tcMar>
-          </w:tcPr>
-          <w:p>
-            <w:pPr>
-              <w:spacing w:before="0" w:after="0" w:line="140" w:lineRule="exact"/>
-              <w:pBdr>
-                <w:bottom w:val="single" w:sz="4" w:space="0" w:color="DDE5E0"/>
-              </w:pBdr>
-              <w:ind w:left="216" w:right="216"/>
-            </w:pPr>
-            <w:r>
-              <w:t xml:space="preserve"> </w:t>
             </w:r>
           </w:p>
         </w:tc>
@@ -405,63 +430,106 @@
         <w:tblInd w:type="dxa" w:w="0"/>
       </w:tblPr>
       <w:tblGrid>
-        <w:gridCol w:w="1800"/>
-        <w:gridCol w:w="7560"/>
+        <w:gridCol w:w="1512"/>
+        <w:gridCol w:w="7848"/>
       </w:tblGrid>
       <w:tr>
         <w:trPr>
           <w:cantSplit/>
-          <w:trHeight w:val="1425" w:hRule="atLeast"/>
+          <w:trHeight w:val="1240" w:hRule="atLeast"/>
         </w:trPr>
         <w:tc>
           <w:tcPr>
-            <w:tcW w:type="dxa" w:w="1800"/>
-            <w:vAlign w:val="center"/>
-            <w:shd w:val="clear" w:color="auto" w:fill="EEF5F1"/>
+            <w:tcW w:type="dxa" w:w="1512"/>
+            <w:vAlign w:val="top"/>
+            <w:shd w:val="clear" w:color="auto" w:fill="EAF2ED"/>
             <w:tcMar>
-              <w:top w:w="120" w:type="dxa"/>
-              <w:bottom w:w="120" w:type="dxa"/>
-              <w:start w:w="0" w:type="dxa"/>
-              <w:end w:w="216" w:type="dxa"/>
+              <w:top w:w="170" w:type="dxa"/>
+              <w:bottom w:w="90" w:type="dxa"/>
+              <w:start w:w="170" w:type="dxa"/>
+              <w:end w:w="50" w:type="dxa"/>
             </w:tcMar>
             <w:tcBorders>
-              <w:right w:val="single" w:sz="4" w:space="0" w:color="DDE5E0"/>
-              <w:bottom w:val="single" w:sz="4" w:space="0" w:color="DDE5E0"/>
+              <w:right w:val="nil" w:sz="4" w:space="0" w:color="DDE5E0"/>
+              <w:bottom w:val="single" w:sz="16" w:space="0" w:color="FFFFFF"/>
+              <w:end w:val="nil"/>
+              <w:top w:val="single" w:sz="16" w:space="0" w:color="FFFFFF"/>
             </w:tcBorders>
           </w:tcPr>
           <w:p>
             <w:pPr>
-              <w:pStyle w:val="SessionNumber"/>
+              <w:pStyle w:val="AgendaTime"/>
+              <w:jc w:val="left"/>
+              <w:ind w:left="0" w:right="0" w:firstLine="0" w:hanging="0"/>
+              <w:spacing w:before="0" w:after="0"/>
             </w:pPr>
             <w:r>
               <w:rPr>
-                <w:spacing w:val="3"/>
+                <w:rFonts w:ascii="Arial" w:hAnsi="Arial" w:cs="Arial"/>
+                <w:b w:val="1"/>
+                <w:bCs w:val="1"/>
+                <w:color w:val="142019"/>
+                <w:sz w:val="26"/>
+                <w:szCs w:val="26"/>
               </w:rPr>
-              <w:t>0</w:t>
+              <w:t>8</w:t>
             </w:r>
-          </w:p>
-          <w:p>
-            <w:pPr>
-              <w:pStyle w:val="AgendaTime"/>
-            </w:pPr>
             <w:r>
-              <w:t>8</w:t>
+              <w:br/>
+            </w:r>
+            <w:r>
+              <w:rPr>
+                <w:rFonts w:ascii="Arial" w:hAnsi="Arial" w:cs="Arial"/>
+                <w:b w:val="1"/>
+                <w:bCs w:val="1"/>
+                <w:color w:val="657169"/>
+                <w:sz w:val="13"/>
+                <w:szCs w:val="13"/>
+                <w:spacing w:val="4"/>
+              </w:rPr>
+              <w:t/>
+            </w:r>
+            <w:r>
+              <w:rPr>
+                <w:rFonts w:ascii="Arial" w:hAnsi="Arial" w:cs="Arial"/>
+                <w:b w:val="0"/>
+                <w:bCs w:val="0"/>
+                <w:color w:val="8A948E"/>
+                <w:sz w:val="13"/>
+                <w:szCs w:val="13"/>
+              </w:rPr>
+              <w:t xml:space="preserve"/>
+            </w:r>
+            <w:r>
+              <w:rPr>
+                <w:rFonts w:ascii="Arial" w:hAnsi="Arial" w:cs="Arial"/>
+                <w:b w:val="1"/>
+                <w:bCs w:val="1"/>
+                <w:color w:val="016F3B"/>
+                <w:sz w:val="13"/>
+                <w:szCs w:val="13"/>
+                <w:spacing w:val="4"/>
+              </w:rPr>
+              <w:t/>
             </w:r>
           </w:p>
         </w:tc>
         <w:tc>
           <w:tcPr>
-            <w:tcW w:type="dxa" w:w="7560"/>
-            <w:vAlign w:val="center"/>
+            <w:tcW w:type="dxa" w:w="7848"/>
+            <w:vAlign w:val="top"/>
             <w:shd w:val="clear" w:color="auto" w:fill="FFFFFF"/>
             <w:tcMar>
-              <w:top w:w="120" w:type="dxa"/>
-              <w:bottom w:w="120" w:type="dxa"/>
+              <w:top w:w="170" w:type="dxa"/>
+              <w:bottom w:w="90" w:type="dxa"/>
               <w:start w:w="216" w:type="dxa"/>
               <w:end w:w="216" w:type="dxa"/>
             </w:tcMar>
             <w:tcBorders>
-              <w:bottom w:val="single" w:sz="4" w:space="0" w:color="DDE5E0"/>
+              <w:bottom w:val="nil" w:sz="4" w:space="0" w:color="DDE5E0"/>
+              <w:left w:val="nil"/>
+              <w:start w:val="nil"/>
+              <w:top w:val="nil"/>
             </w:tcBorders>
           </w:tcPr>
           <w:p>
@@ -485,57 +553,100 @@
       <w:tr>
         <w:trPr>
           <w:cantSplit/>
-          <w:trHeight w:val="1425" w:hRule="atLeast"/>
+          <w:trHeight w:val="1240" w:hRule="atLeast"/>
         </w:trPr>
         <w:tc>
           <w:tcPr>
-            <w:tcW w:type="dxa" w:w="1800"/>
-            <w:vAlign w:val="center"/>
-            <w:shd w:val="clear" w:color="auto" w:fill="EEF5F1"/>
+            <w:tcW w:type="dxa" w:w="1512"/>
+            <w:vAlign w:val="top"/>
+            <w:shd w:val="clear" w:color="auto" w:fill="EAF2ED"/>
             <w:tcMar>
-              <w:top w:w="120" w:type="dxa"/>
-              <w:bottom w:w="120" w:type="dxa"/>
-              <w:start w:w="0" w:type="dxa"/>
-              <w:end w:w="216" w:type="dxa"/>
+              <w:top w:w="170" w:type="dxa"/>
+              <w:bottom w:w="90" w:type="dxa"/>
+              <w:start w:w="170" w:type="dxa"/>
+              <w:end w:w="50" w:type="dxa"/>
             </w:tcMar>
             <w:tcBorders>
-              <w:right w:val="single" w:sz="4" w:space="0" w:color="DDE5E0"/>
-              <w:bottom w:val="single" w:sz="4" w:space="0" w:color="DDE5E0"/>
+              <w:right w:val="nil" w:sz="4" w:space="0" w:color="DDE5E0"/>
+              <w:bottom w:val="single" w:sz="16" w:space="0" w:color="FFFFFF"/>
+              <w:end w:val="nil"/>
+              <w:top w:val="single" w:sz="16" w:space="0" w:color="FFFFFF"/>
             </w:tcBorders>
           </w:tcPr>
           <w:p>
             <w:pPr>
-              <w:pStyle w:val="SessionNumber"/>
+              <w:pStyle w:val="AgendaTime"/>
+              <w:jc w:val="left"/>
+              <w:ind w:left="0" w:right="0" w:firstLine="0" w:hanging="0"/>
+              <w:spacing w:before="0" w:after="0"/>
             </w:pPr>
             <w:r>
               <w:rPr>
-                <w:spacing w:val="3"/>
+                <w:rFonts w:ascii="Arial" w:hAnsi="Arial" w:cs="Arial"/>
+                <w:b w:val="1"/>
+                <w:bCs w:val="1"/>
+                <w:color w:val="142019"/>
+                <w:sz w:val="26"/>
+                <w:szCs w:val="26"/>
               </w:rPr>
-              <w:t>0</w:t>
+              <w:t>9</w:t>
             </w:r>
-          </w:p>
-          <w:p>
-            <w:pPr>
-              <w:pStyle w:val="AgendaTime"/>
-            </w:pPr>
             <w:r>
-              <w:t>9</w:t>
+              <w:br/>
+            </w:r>
+            <w:r>
+              <w:rPr>
+                <w:rFonts w:ascii="Arial" w:hAnsi="Arial" w:cs="Arial"/>
+                <w:b w:val="1"/>
+                <w:bCs w:val="1"/>
+                <w:color w:val="657169"/>
+                <w:sz w:val="13"/>
+                <w:szCs w:val="13"/>
+                <w:spacing w:val="4"/>
+              </w:rPr>
+              <w:t/>
+            </w:r>
+            <w:r>
+              <w:rPr>
+                <w:rFonts w:ascii="Arial" w:hAnsi="Arial" w:cs="Arial"/>
+                <w:b w:val="0"/>
+                <w:bCs w:val="0"/>
+                <w:color w:val="8A948E"/>
+                <w:sz w:val="13"/>
+                <w:szCs w:val="13"/>
+              </w:rPr>
+              <w:t xml:space="preserve"/>
+            </w:r>
+            <w:r>
+              <w:rPr>
+                <w:rFonts w:ascii="Arial" w:hAnsi="Arial" w:cs="Arial"/>
+                <w:b w:val="1"/>
+                <w:bCs w:val="1"/>
+                <w:color w:val="016F3B"/>
+                <w:sz w:val="13"/>
+                <w:szCs w:val="13"/>
+                <w:spacing w:val="4"/>
+              </w:rPr>
+              <w:t/>
             </w:r>
           </w:p>
         </w:tc>
         <w:tc>
           <w:tcPr>
-            <w:tcW w:type="dxa" w:w="7560"/>
-            <w:vAlign w:val="center"/>
+            <w:tcW w:type="dxa" w:w="7848"/>
+            <w:vAlign w:val="top"/>
             <w:shd w:val="clear" w:color="auto" w:fill="FFFFFF"/>
             <w:tcMar>
-              <w:top w:w="120" w:type="dxa"/>
-              <w:bottom w:w="120" w:type="dxa"/>
+              <w:top w:w="170" w:type="dxa"/>
+              <w:bottom w:w="90" w:type="dxa"/>
               <w:start w:w="216" w:type="dxa"/>
               <w:end w:w="216" w:type="dxa"/>
             </w:tcMar>
             <w:tcBorders>
-              <w:bottom w:val="single" w:sz="4" w:space="0" w:color="DDE5E0"/>
+              <w:bottom w:val="nil" w:sz="4" w:space="0" w:color="DDE5E0"/>
+              <w:left w:val="nil"/>
+              <w:start w:val="nil"/>
+              <w:top w:val="nil"/>
             </w:tcBorders>
           </w:tcPr>
           <w:p>
@@ -559,72 +670,112 @@
       <w:tr>
         <w:trPr>
           <w:cantSplit/>
-          <w:trHeight w:val="480" w:hRule="atLeast"/>
+          <w:trHeight w:val="400" w:hRule="atLeast"/>
         </w:trPr>
         <w:tc>
           <w:tcPr>
-            <w:tcW w:type="dxa" w:w="1800"/>
+            <w:tcW w:type="dxa" w:w="1512"/>
             <w:vAlign w:val="center"/>
             <w:shd w:val="clear" w:color="auto" w:fill="F2F7F4"/>
             <w:tcMar>
-              <w:top w:w="80" w:type="dxa"/>
-              <w:bottom w:w="80" w:type="dxa"/>
-              <w:start w:w="0" w:type="dxa"/>
-              <w:end w:w="216" w:type="dxa"/>
+              <w:top w:w="55" w:type="dxa"/>
+              <w:bottom w:w="55" w:type="dxa"/>
+              <w:start w:w="170" w:type="dxa"/>
+              <w:end w:w="50" w:type="dxa"/>
             </w:tcMar>
             <w:tcBorders>
-              <w:top w:val="single" w:sz="4" w:space="0" w:color="D7E4DC"/>
-              <w:bottom w:val="single" w:sz="4" w:space="0" w:color="D7E4DC"/>
+              <w:top w:val="single" w:sz="8" w:space="0" w:color="FFFFFF"/>
+              <w:bottom w:val="single" w:sz="8" w:space="0" w:color="FFFFFF"/>
+              <w:right w:val="nil"/>
+              <w:end w:val="nil"/>
             </w:tcBorders>
           </w:tcPr>
           <w:p>
             <w:pPr>
               <w:pStyle w:val="AgendaBreakTime"/>
-              <w:jc w:val="right"/>
+              <w:jc w:val="left"/>
+              <w:ind w:left="0" w:right="0" w:firstLine="0" w:hanging="0"/>
+              <w:spacing w:before="0" w:after="0"/>
             </w:pPr>
             <w:r>
+              <w:rPr>
+                <w:rFonts w:ascii="Arial" w:hAnsi="Arial" w:cs="Arial"/>
+                <w:b w:val="1"/>
+                <w:bCs w:val="1"/>
+                <w:color w:val="46534B"/>
+                <w:sz w:val="17"/>
+                <w:szCs w:val="17"/>
+              </w:rPr>
               <w:t>1</w:t>
+            </w:r>
+            <w:r>
+              <w:rPr>
+                <w:rFonts w:ascii="Arial" w:hAnsi="Arial" w:cs="Arial"/>
+                <w:b w:val="0"/>
+                <w:bCs w:val="0"/>
+                <w:color w:val="657169"/>
+                <w:sz w:val="14"/>
+                <w:szCs w:val="14"/>
+                <w:spacing w:val="3"/>
+              </w:rPr>
+              <w:t xml:space="preserve"/>
             </w:r>
           </w:p>
         </w:tc>
         <w:tc>
           <w:tcPr>
-            <w:tcW w:type="dxa" w:w="7560"/>
+            <w:tcW w:type="dxa" w:w="7848"/>
             <w:vAlign w:val="center"/>
             <w:shd w:val="clear" w:color="auto" w:fill="F2F7F4"/>
             <w:tcMar>
-              <w:top w:w="80" w:type="dxa"/>
-              <w:bottom w:w="80" w:type="dxa"/>
+              <w:top w:w="55" w:type="dxa"/>
+              <w:bottom w:w="55" w:type="dxa"/>
               <w:start w:w="216" w:type="dxa"/>
               <w:end w:w="216" w:type="dxa"/>
             </w:tcMar>
             <w:tcBorders>
-              <w:top w:val="single" w:sz="4" w:space="0" w:color="016F3B"/>
-              <w:bottom w:val="single" w:sz="4" w:space="0" w:color="D7E4DC"/>
+              <w:top w:val="single" w:sz="8" w:space="0" w:color="FFFFFF"/>
+              <w:bottom w:val="single" w:sz="8" w:space="0" w:color="FFFFFF"/>
+              <w:left w:val="nil"/>
+              <w:start w:val="nil"/>
             </w:tcBorders>
           </w:tcPr>
           <w:p>
             <w:pPr>
               <w:pStyle w:val="BreakLabel"/>
               <w:jc w:val="left"/>
+              <w:ind w:left="0" w:right="0" w:firstLine="0" w:hanging="0"/>
+              <w:spacing w:before="0" w:after="0"/>
+              <w:tabs>
+                <w:tab w:val="right" w:pos="7420"/>
+              </w:tabs>
             </w:pPr>
             <w:r>
               <w:rPr>
-                <w:rFonts w:ascii="Arial" w:hAnsi="Arial" w:eastAsia="Arial" w:cs="Arial"/>
-                <w:b/>
+                <w:rFonts w:ascii="Arial" w:hAnsi="Arial" w:cs="Arial"/>
+                <w:b w:val="1"/>
+                <w:bCs w:val="1"/>
                 <w:color w:val="016F3B"/>
                 <w:sz w:val="16"/>
+                <w:szCs w:val="16"/>
+                <w:spacing w:val="2"/>
               </w:rPr>
               <w:t>C</w:t>
             </w:r>
             <w:r>
+              <w:tab/>
+            </w:r>
+            <w:r>
               <w:rPr>
-                <w:rFonts w:ascii="Arial" w:hAnsi="Arial" w:eastAsia="Arial" w:cs="Arial"/>
+                <w:rFonts w:ascii="Arial" w:hAnsi="Arial" w:cs="Arial"/>
                 <w:b w:val="0"/>
+                <w:bCs w:val="0"/>
                 <w:color w:val="657169"/>
                 <w:sz w:val="15"/>
+                <w:szCs w:val="15"/>
+                <w:spacing w:val="4"/>
               </w:rPr>
-              <w:t xml:space="preserve"/>
+              <w:t/>
             </w:r>
           </w:p>
         </w:tc>
@@ -632,57 +783,100 @@
       <w:tr>
         <w:trPr>
           <w:cantSplit/>
-          <w:trHeight w:val="1425" w:hRule="atLeast"/>
+          <w:trHeight w:val="1240" w:hRule="atLeast"/>
         </w:trPr>
         <w:tc>
           <w:tcPr>
-            <w:tcW w:type="dxa" w:w="1800"/>
-            <w:vAlign w:val="center"/>
-            <w:shd w:val="clear" w:color="auto" w:fill="EEF5F1"/>
+            <w:tcW w:type="dxa" w:w="1512"/>
+            <w:vAlign w:val="top"/>
+            <w:shd w:val="clear" w:color="auto" w:fill="EAF2ED"/>
             <w:tcMar>
-              <w:top w:w="120" w:type="dxa"/>
-              <w:bottom w:w="120" w:type="dxa"/>
-              <w:start w:w="0" w:type="dxa"/>
-              <w:end w:w="216" w:type="dxa"/>
+              <w:top w:w="170" w:type="dxa"/>
+              <w:bottom w:w="90" w:type="dxa"/>
+              <w:start w:w="170" w:type="dxa"/>
+              <w:end w:w="50" w:type="dxa"/>
             </w:tcMar>
             <w:tcBorders>
-              <w:right w:val="single" w:sz="4" w:space="0" w:color="DDE5E0"/>
-              <w:bottom w:val="single" w:sz="4" w:space="0" w:color="DDE5E0"/>
+              <w:right w:val="nil" w:sz="4" w:space="0" w:color="DDE5E0"/>
+              <w:bottom w:val="single" w:sz="16" w:space="0" w:color="FFFFFF"/>
+              <w:end w:val="nil"/>
+              <w:top w:val="single" w:sz="16" w:space="0" w:color="FFFFFF"/>
             </w:tcBorders>
           </w:tcPr>
           <w:p>
             <w:pPr>
-              <w:pStyle w:val="SessionNumber"/>
+              <w:pStyle w:val="AgendaTime"/>
+              <w:jc w:val="left"/>
+              <w:ind w:left="0" w:right="0" w:firstLine="0" w:hanging="0"/>
+              <w:spacing w:before="0" w:after="0"/>
             </w:pPr>
             <w:r>
               <w:rPr>
-                <w:spacing w:val="3"/>
+                <w:rFonts w:ascii="Arial" w:hAnsi="Arial" w:cs="Arial"/>
+                <w:b w:val="1"/>
+                <w:bCs w:val="1"/>
+                <w:color w:val="142019"/>
+                <w:sz w:val="26"/>
+                <w:szCs w:val="26"/>
               </w:rPr>
-              <w:t>0</w:t>
+              <w:t>1</w:t>
             </w:r>
-          </w:p>
-          <w:p>
-            <w:pPr>
-              <w:pStyle w:val="AgendaTime"/>
-            </w:pPr>
             <w:r>
-              <w:t>1</w:t>
+              <w:br/>
+            </w:r>
+            <w:r>
+              <w:rPr>
+                <w:rFonts w:ascii="Arial" w:hAnsi="Arial" w:cs="Arial"/>
+                <w:b w:val="1"/>
+                <w:bCs w:val="1"/>
+                <w:color w:val="657169"/>
+                <w:sz w:val="13"/>
+                <w:szCs w:val="13"/>
+                <w:spacing w:val="4"/>
+              </w:rPr>
+              <w:t/>
+            </w:r>
+            <w:r>
+              <w:rPr>
+                <w:rFonts w:ascii="Arial" w:hAnsi="Arial" w:cs="Arial"/>
+                <w:b w:val="0"/>
+                <w:bCs w:val="0"/>
+                <w:color w:val="8A948E"/>
+                <w:sz w:val="13"/>
+                <w:szCs w:val="13"/>
+              </w:rPr>
+              <w:t xml:space="preserve"/>
+            </w:r>
+            <w:r>
+              <w:rPr>
+                <w:rFonts w:ascii="Arial" w:hAnsi="Arial" w:cs="Arial"/>
+                <w:b w:val="1"/>
+                <w:bCs w:val="1"/>
+                <w:color w:val="016F3B"/>
+                <w:sz w:val="13"/>
+                <w:szCs w:val="13"/>
+                <w:spacing w:val="4"/>
+              </w:rPr>
+              <w:t/>
             </w:r>
           </w:p>
         </w:tc>
         <w:tc>
           <w:tcPr>
-            <w:tcW w:type="dxa" w:w="7560"/>
-            <w:vAlign w:val="center"/>
+            <w:tcW w:type="dxa" w:w="7848"/>
+            <w:vAlign w:val="top"/>
             <w:shd w:val="clear" w:color="auto" w:fill="FFFFFF"/>
             <w:tcMar>
-              <w:top w:w="120" w:type="dxa"/>
-              <w:bottom w:w="120" w:type="dxa"/>
+              <w:top w:w="170" w:type="dxa"/>
+              <w:bottom w:w="90" w:type="dxa"/>
               <w:start w:w="216" w:type="dxa"/>
               <w:end w:w="216" w:type="dxa"/>
             </w:tcMar>
             <w:tcBorders>
-              <w:bottom w:val="single" w:sz="4" w:space="0" w:color="DDE5E0"/>
+              <w:bottom w:val="nil" w:sz="4" w:space="0" w:color="DDE5E0"/>
+              <w:left w:val="nil"/>
+              <w:start w:val="nil"/>
+              <w:top w:val="nil"/>
             </w:tcBorders>
           </w:tcPr>
           <w:p>
@@ -706,57 +900,100 @@
       <w:tr>
         <w:trPr>
           <w:cantSplit/>
-          <w:trHeight w:val="1425" w:hRule="atLeast"/>
+          <w:trHeight w:val="1240" w:hRule="atLeast"/>
         </w:trPr>
         <w:tc>
           <w:tcPr>
-            <w:tcW w:type="dxa" w:w="1800"/>
-            <w:vAlign w:val="center"/>
-            <w:shd w:val="clear" w:color="auto" w:fill="EEF5F1"/>
+            <w:tcW w:type="dxa" w:w="1512"/>
+            <w:vAlign w:val="top"/>
+            <w:shd w:val="clear" w:color="auto" w:fill="EAF2ED"/>
             <w:tcMar>
-              <w:top w:w="120" w:type="dxa"/>
-              <w:bottom w:w="120" w:type="dxa"/>
-              <w:start w:w="0" w:type="dxa"/>
-              <w:end w:w="216" w:type="dxa"/>
+              <w:top w:w="170" w:type="dxa"/>
+              <w:bottom w:w="90" w:type="dxa"/>
+              <w:start w:w="170" w:type="dxa"/>
+              <w:end w:w="50" w:type="dxa"/>
             </w:tcMar>
             <w:tcBorders>
-              <w:right w:val="single" w:sz="4" w:space="0" w:color="DDE5E0"/>
-              <w:bottom w:val="single" w:sz="4" w:space="0" w:color="DDE5E0"/>
+              <w:right w:val="nil" w:sz="4" w:space="0" w:color="DDE5E0"/>
+              <w:bottom w:val="single" w:sz="16" w:space="0" w:color="FFFFFF"/>
+              <w:end w:val="nil"/>
+              <w:top w:val="single" w:sz="16" w:space="0" w:color="FFFFFF"/>
             </w:tcBorders>
           </w:tcPr>
           <w:p>
             <w:pPr>
-              <w:pStyle w:val="SessionNumber"/>
+              <w:pStyle w:val="AgendaTime"/>
+              <w:jc w:val="left"/>
+              <w:ind w:left="0" w:right="0" w:firstLine="0" w:hanging="0"/>
+              <w:spacing w:before="0" w:after="0"/>
             </w:pPr>
             <w:r>
               <w:rPr>
-                <w:spacing w:val="3"/>
+                <w:rFonts w:ascii="Arial" w:hAnsi="Arial" w:cs="Arial"/>
+                <w:b w:val="1"/>
+                <w:bCs w:val="1"/>
+                <w:color w:val="142019"/>
+                <w:sz w:val="26"/>
+                <w:szCs w:val="26"/>
               </w:rPr>
-              <w:t>0</w:t>
+              <w:t>1</w:t>
             </w:r>
-          </w:p>
-          <w:p>
-            <w:pPr>
-              <w:pStyle w:val="AgendaTime"/>
-            </w:pPr>
             <w:r>
-              <w:t>1</w:t>
+              <w:br/>
+            </w:r>
+            <w:r>
+              <w:rPr>
+                <w:rFonts w:ascii="Arial" w:hAnsi="Arial" w:cs="Arial"/>
+                <w:b w:val="1"/>
+                <w:bCs w:val="1"/>
+                <w:color w:val="657169"/>
+                <w:sz w:val="13"/>
+                <w:szCs w:val="13"/>
+                <w:spacing w:val="4"/>
+              </w:rPr>
+              <w:t/>
+            </w:r>
+            <w:r>
+              <w:rPr>
+                <w:rFonts w:ascii="Arial" w:hAnsi="Arial" w:cs="Arial"/>
+                <w:b w:val="0"/>
+                <w:bCs w:val="0"/>
+                <w:color w:val="8A948E"/>
+                <w:sz w:val="13"/>
+                <w:szCs w:val="13"/>
+              </w:rPr>
+              <w:t xml:space="preserve"/>
+            </w:r>
+            <w:r>
+              <w:rPr>
+                <w:rFonts w:ascii="Arial" w:hAnsi="Arial" w:cs="Arial"/>
+                <w:b w:val="1"/>
+                <w:bCs w:val="1"/>
+                <w:color w:val="016F3B"/>
+                <w:sz w:val="13"/>
+                <w:szCs w:val="13"/>
+                <w:spacing w:val="4"/>
+              </w:rPr>
+              <w:t/>
             </w:r>
           </w:p>
         </w:tc>
         <w:tc>
           <w:tcPr>
-            <w:tcW w:type="dxa" w:w="7560"/>
-            <w:vAlign w:val="center"/>
+            <w:tcW w:type="dxa" w:w="7848"/>
+            <w:vAlign w:val="top"/>
             <w:shd w:val="clear" w:color="auto" w:fill="FFFFFF"/>
             <w:tcMar>
-              <w:top w:w="120" w:type="dxa"/>
-              <w:bottom w:w="120" w:type="dxa"/>
+              <w:top w:w="170" w:type="dxa"/>
+              <w:bottom w:w="90" w:type="dxa"/>
               <w:start w:w="216" w:type="dxa"/>
               <w:end w:w="216" w:type="dxa"/>
             </w:tcMar>
             <w:tcBorders>
-              <w:bottom w:val="single" w:sz="4" w:space="0" w:color="DDE5E0"/>
+              <w:bottom w:val="nil" w:sz="4" w:space="0" w:color="DDE5E0"/>
+              <w:left w:val="nil"/>
+              <w:start w:val="nil"/>
+              <w:top w:val="nil"/>
             </w:tcBorders>
           </w:tcPr>
           <w:p>
@@ -780,72 +1017,112 @@
       <w:tr>
         <w:trPr>
           <w:cantSplit/>
-          <w:trHeight w:val="480" w:hRule="atLeast"/>
+          <w:trHeight w:val="400" w:hRule="atLeast"/>
         </w:trPr>
         <w:tc>
           <w:tcPr>
-            <w:tcW w:type="dxa" w:w="1800"/>
+            <w:tcW w:type="dxa" w:w="1512"/>
             <w:vAlign w:val="center"/>
             <w:shd w:val="clear" w:color="auto" w:fill="F2F7F4"/>
             <w:tcMar>
-              <w:top w:w="80" w:type="dxa"/>
-              <w:bottom w:w="80" w:type="dxa"/>
-              <w:start w:w="0" w:type="dxa"/>
-              <w:end w:w="216" w:type="dxa"/>
+              <w:top w:w="55" w:type="dxa"/>
+              <w:bottom w:w="55" w:type="dxa"/>
+              <w:start w:w="170" w:type="dxa"/>
+              <w:end w:w="50" w:type="dxa"/>
             </w:tcMar>
             <w:tcBorders>
-              <w:top w:val="single" w:sz="4" w:space="0" w:color="D7E4DC"/>
-              <w:bottom w:val="single" w:sz="4" w:space="0" w:color="D7E4DC"/>
+              <w:top w:val="single" w:sz="8" w:space="0" w:color="FFFFFF"/>
+              <w:bottom w:val="single" w:sz="8" w:space="0" w:color="FFFFFF"/>
+              <w:right w:val="nil"/>
+              <w:end w:val="nil"/>
             </w:tcBorders>
           </w:tcPr>
           <w:p>
             <w:pPr>
               <w:pStyle w:val="AgendaBreakTime"/>
-              <w:jc w:val="right"/>
+              <w:jc w:val="left"/>
+              <w:ind w:left="0" w:right="0" w:firstLine="0" w:hanging="0"/>
+              <w:spacing w:before="0" w:after="0"/>
             </w:pPr>
             <w:r>
+              <w:rPr>
+                <w:rFonts w:ascii="Arial" w:hAnsi="Arial" w:cs="Arial"/>
+                <w:b w:val="1"/>
+                <w:bCs w:val="1"/>
+                <w:color w:val="46534B"/>
+                <w:sz w:val="17"/>
+                <w:szCs w:val="17"/>
+              </w:rPr>
               <w:t>1</w:t>
+            </w:r>
+            <w:r>
+              <w:rPr>
+                <w:rFonts w:ascii="Arial" w:hAnsi="Arial" w:cs="Arial"/>
+                <w:b w:val="0"/>
+                <w:bCs w:val="0"/>
+                <w:color w:val="657169"/>
+                <w:sz w:val="14"/>
+                <w:szCs w:val="14"/>
+                <w:spacing w:val="3"/>
+              </w:rPr>
+              <w:t xml:space="preserve"/>
             </w:r>
           </w:p>
         </w:tc>
         <w:tc>
           <w:tcPr>
-            <w:tcW w:type="dxa" w:w="7560"/>
+            <w:tcW w:type="dxa" w:w="7848"/>
             <w:vAlign w:val="center"/>
             <w:shd w:val="clear" w:color="auto" w:fill="F2F7F4"/>
             <w:tcMar>
-              <w:top w:w="80" w:type="dxa"/>
-              <w:bottom w:w="80" w:type="dxa"/>
+              <w:top w:w="55" w:type="dxa"/>
+              <w:bottom w:w="55" w:type="dxa"/>
               <w:start w:w="216" w:type="dxa"/>
               <w:end w:w="216" w:type="dxa"/>
             </w:tcMar>
             <w:tcBorders>
-              <w:top w:val="single" w:sz="4" w:space="0" w:color="016F3B"/>
-              <w:bottom w:val="single" w:sz="4" w:space="0" w:color="D7E4DC"/>
+              <w:top w:val="single" w:sz="8" w:space="0" w:color="FFFFFF"/>
+              <w:bottom w:val="single" w:sz="8" w:space="0" w:color="FFFFFF"/>
+              <w:left w:val="nil"/>
+              <w:start w:val="nil"/>
             </w:tcBorders>
           </w:tcPr>
           <w:p>
             <w:pPr>
               <w:pStyle w:val="BreakLabel"/>
               <w:jc w:val="left"/>
+              <w:ind w:left="0" w:right="0" w:firstLine="0" w:hanging="0"/>
+              <w:spacing w:before="0" w:after="0"/>
+              <w:tabs>
+                <w:tab w:val="right" w:pos="7420"/>
+              </w:tabs>
             </w:pPr>
             <w:r>
               <w:rPr>
-                <w:rFonts w:ascii="Arial" w:hAnsi="Arial" w:eastAsia="Arial" w:cs="Arial"/>
-                <w:b/>
+                <w:rFonts w:ascii="Arial" w:hAnsi="Arial" w:cs="Arial"/>
+                <w:b w:val="1"/>
+                <w:bCs w:val="1"/>
                 <w:color w:val="016F3B"/>
                 <w:sz w:val="16"/>
+                <w:szCs w:val="16"/>
+                <w:spacing w:val="2"/>
               </w:rPr>
               <w:t>C</w:t>
             </w:r>
             <w:r>
+              <w:tab/>
+            </w:r>
+            <w:r>
               <w:rPr>
-                <w:rFonts w:ascii="Arial" w:hAnsi="Arial" w:eastAsia="Arial" w:cs="Arial"/>
+                <w:rFonts w:ascii="Arial" w:hAnsi="Arial" w:cs="Arial"/>
                 <w:b w:val="0"/>
+                <w:bCs w:val="0"/>
                 <w:color w:val="657169"/>
                 <w:sz w:val="15"/>
+                <w:szCs w:val="15"/>
+                <w:spacing w:val="4"/>
               </w:rPr>
-              <w:t xml:space="preserve"/>
+              <w:t/>
             </w:r>
           </w:p>
         </w:tc>
@@ -853,57 +1130,100 @@
       <w:tr>
         <w:trPr>
           <w:cantSplit/>
-          <w:trHeight w:val="1425" w:hRule="atLeast"/>
+          <w:trHeight w:val="1240" w:hRule="atLeast"/>
         </w:trPr>
         <w:tc>
           <w:tcPr>
-            <w:tcW w:type="dxa" w:w="1800"/>
-            <w:vAlign w:val="center"/>
-            <w:shd w:val="clear" w:color="auto" w:fill="EEF5F1"/>
+            <w:tcW w:type="dxa" w:w="1512"/>
+            <w:vAlign w:val="top"/>
+            <w:shd w:val="clear" w:color="auto" w:fill="EAF2ED"/>
             <w:tcMar>
-              <w:top w:w="120" w:type="dxa"/>
-              <w:bottom w:w="120" w:type="dxa"/>
-              <w:start w:w="0" w:type="dxa"/>
-              <w:end w:w="216" w:type="dxa"/>
+              <w:top w:w="170" w:type="dxa"/>
+              <w:bottom w:w="90" w:type="dxa"/>
+              <w:start w:w="170" w:type="dxa"/>
+              <w:end w:w="50" w:type="dxa"/>
             </w:tcMar>
             <w:tcBorders>
-              <w:right w:val="single" w:sz="4" w:space="0" w:color="DDE5E0"/>
-              <w:bottom w:val="single" w:sz="4" w:space="0" w:color="DDE5E0"/>
+              <w:right w:val="nil" w:sz="4" w:space="0" w:color="DDE5E0"/>
+              <w:bottom w:val="single" w:sz="16" w:space="0" w:color="FFFFFF"/>
+              <w:end w:val="nil"/>
+              <w:top w:val="single" w:sz="16" w:space="0" w:color="FFFFFF"/>
             </w:tcBorders>
           </w:tcPr>
           <w:p>
             <w:pPr>
-              <w:pStyle w:val="SessionNumber"/>
+              <w:pStyle w:val="AgendaTime"/>
+              <w:jc w:val="left"/>
+              <w:ind w:left="0" w:right="0" w:firstLine="0" w:hanging="0"/>
+              <w:spacing w:before="0" w:after="0"/>
             </w:pPr>
             <w:r>
               <w:rPr>
-                <w:spacing w:val="3"/>
+                <w:rFonts w:ascii="Arial" w:hAnsi="Arial" w:cs="Arial"/>
+                <w:b w:val="1"/>
+                <w:bCs w:val="1"/>
+                <w:color w:val="142019"/>
+                <w:sz w:val="26"/>
+                <w:szCs w:val="26"/>
               </w:rPr>
-              <w:t>0</w:t>
+              <w:t>1</w:t>
             </w:r>
-          </w:p>
-          <w:p>
-            <w:pPr>
-              <w:pStyle w:val="AgendaTime"/>
-            </w:pPr>
             <w:r>
-              <w:t>1</w:t>
+              <w:br/>
+            </w:r>
+            <w:r>
+              <w:rPr>
+                <w:rFonts w:ascii="Arial" w:hAnsi="Arial" w:cs="Arial"/>
+                <w:b w:val="1"/>
+                <w:bCs w:val="1"/>
+                <w:color w:val="657169"/>
+                <w:sz w:val="13"/>
+                <w:szCs w:val="13"/>
+                <w:spacing w:val="4"/>
+              </w:rPr>
+              <w:t/>
+            </w:r>
+            <w:r>
+              <w:rPr>
+                <w:rFonts w:ascii="Arial" w:hAnsi="Arial" w:cs="Arial"/>
+                <w:b w:val="0"/>
+                <w:bCs w:val="0"/>
+                <w:color w:val="8A948E"/>
+                <w:sz w:val="13"/>
+                <w:szCs w:val="13"/>
+              </w:rPr>
+              <w:t xml:space="preserve"/>
+            </w:r>
+            <w:r>
+              <w:rPr>
+                <w:rFonts w:ascii="Arial" w:hAnsi="Arial" w:cs="Arial"/>
+                <w:b w:val="1"/>
+                <w:bCs w:val="1"/>
+                <w:color w:val="016F3B"/>
+                <w:sz w:val="13"/>
+                <w:szCs w:val="13"/>
+                <w:spacing w:val="4"/>
+              </w:rPr>
+              <w:t/>
             </w:r>
           </w:p>
         </w:tc>
         <w:tc>
           <w:tcPr>
-            <w:tcW w:type="dxa" w:w="7560"/>
-            <w:vAlign w:val="center"/>
+            <w:tcW w:type="dxa" w:w="7848"/>
+            <w:vAlign w:val="top"/>
             <w:shd w:val="clear" w:color="auto" w:fill="FFFFFF"/>
             <w:tcMar>
-              <w:top w:w="120" w:type="dxa"/>
-              <w:bottom w:w="120" w:type="dxa"/>
+              <w:top w:w="170" w:type="dxa"/>
+              <w:bottom w:w="90" w:type="dxa"/>
               <w:start w:w="216" w:type="dxa"/>
               <w:end w:w="216" w:type="dxa"/>
             </w:tcMar>
             <w:tcBorders>
-              <w:bottom w:val="single" w:sz="4" w:space="0" w:color="DDE5E0"/>
+              <w:bottom w:val="nil" w:sz="4" w:space="0" w:color="DDE5E0"/>
+              <w:left w:val="nil"/>
+              <w:start w:val="nil"/>
+              <w:top w:val="nil"/>
             </w:tcBorders>
           </w:tcPr>
           <w:p>
@@ -927,57 +1247,100 @@
       <w:tr>
         <w:trPr>
           <w:cantSplit/>
-          <w:trHeight w:val="1425" w:hRule="atLeast"/>
+          <w:trHeight w:val="1240" w:hRule="atLeast"/>
         </w:trPr>
         <w:tc>
           <w:tcPr>
-            <w:tcW w:type="dxa" w:w="1800"/>
-            <w:vAlign w:val="center"/>
-            <w:shd w:val="clear" w:color="auto" w:fill="EEF5F1"/>
+            <w:tcW w:type="dxa" w:w="1512"/>
+            <w:vAlign w:val="top"/>
+            <w:shd w:val="clear" w:color="auto" w:fill="EAF2ED"/>
             <w:tcMar>
-              <w:top w:w="120" w:type="dxa"/>
-              <w:bottom w:w="120" w:type="dxa"/>
-              <w:start w:w="0" w:type="dxa"/>
-              <w:end w:w="216" w:type="dxa"/>
+              <w:top w:w="170" w:type="dxa"/>
+              <w:bottom w:w="90" w:type="dxa"/>
+              <w:start w:w="170" w:type="dxa"/>
+              <w:end w:w="50" w:type="dxa"/>
             </w:tcMar>
             <w:tcBorders>
-              <w:right w:val="single" w:sz="4" w:space="0" w:color="DDE5E0"/>
-              <w:bottom w:val="single" w:sz="4" w:space="0" w:color="DDE5E0"/>
+              <w:right w:val="nil" w:sz="4" w:space="0" w:color="DDE5E0"/>
+              <w:bottom w:val="single" w:sz="4" w:space="0" w:color="D5DED9"/>
+              <w:end w:val="nil"/>
+              <w:top w:val="single" w:sz="16" w:space="0" w:color="FFFFFF"/>
             </w:tcBorders>
           </w:tcPr>
           <w:p>
             <w:pPr>
-              <w:pStyle w:val="SessionNumber"/>
+              <w:pStyle w:val="AgendaTime"/>
+              <w:jc w:val="left"/>
+              <w:ind w:left="0" w:right="0" w:firstLine="0" w:hanging="0"/>
+              <w:spacing w:before="0" w:after="0"/>
             </w:pPr>
             <w:r>
               <w:rPr>
-                <w:spacing w:val="3"/>
+                <w:rFonts w:ascii="Arial" w:hAnsi="Arial" w:cs="Arial"/>
+                <w:b w:val="1"/>
+                <w:bCs w:val="1"/>
+                <w:color w:val="142019"/>
+                <w:sz w:val="26"/>
+                <w:szCs w:val="26"/>
               </w:rPr>
-              <w:t>0</w:t>
+              <w:t>1</w:t>
             </w:r>
-          </w:p>
-          <w:p>
-            <w:pPr>
-              <w:pStyle w:val="AgendaTime"/>
-            </w:pPr>
             <w:r>
-              <w:t>1</w:t>
+              <w:br/>
+            </w:r>
+            <w:r>
+              <w:rPr>
+                <w:rFonts w:ascii="Arial" w:hAnsi="Arial" w:cs="Arial"/>
+                <w:b w:val="1"/>
+                <w:bCs w:val="1"/>
+                <w:color w:val="657169"/>
+                <w:sz w:val="13"/>
+                <w:szCs w:val="13"/>
+                <w:spacing w:val="4"/>
+              </w:rPr>
+              <w:t/>
+            </w:r>
+            <w:r>
+              <w:rPr>
+                <w:rFonts w:ascii="Arial" w:hAnsi="Arial" w:cs="Arial"/>
+                <w:b w:val="0"/>
+                <w:bCs w:val="0"/>
+                <w:color w:val="8A948E"/>
+                <w:sz w:val="13"/>
+                <w:szCs w:val="13"/>
+              </w:rPr>
+              <w:t xml:space="preserve"/>
+            </w:r>
+            <w:r>
+              <w:rPr>
+                <w:rFonts w:ascii="Arial" w:hAnsi="Arial" w:cs="Arial"/>
+                <w:b w:val="1"/>
+                <w:bCs w:val="1"/>
+                <w:color w:val="016F3B"/>
+                <w:sz w:val="13"/>
+                <w:szCs w:val="13"/>
+                <w:spacing w:val="4"/>
+              </w:rPr>
+              <w:t/>
             </w:r>
           </w:p>
         </w:tc>
         <w:tc>
           <w:tcPr>
-            <w:tcW w:type="dxa" w:w="7560"/>
-            <w:vAlign w:val="center"/>
+            <w:tcW w:type="dxa" w:w="7848"/>
+            <w:vAlign w:val="top"/>
             <w:shd w:val="clear" w:color="auto" w:fill="FFFFFF"/>
             <w:tcMar>
-              <w:top w:w="120" w:type="dxa"/>
-              <w:bottom w:w="120" w:type="dxa"/>
+              <w:top w:w="170" w:type="dxa"/>
+              <w:bottom w:w="90" w:type="dxa"/>
               <w:start w:w="216" w:type="dxa"/>
               <w:end w:w="216" w:type="dxa"/>
             </w:tcMar>
             <w:tcBorders>
-              <w:bottom w:val="single" w:sz="4" w:space="0" w:color="DDE5E0"/>
+              <w:bottom w:val="single" w:sz="4" w:space="0" w:color="D5DED9"/>
+              <w:left w:val="nil"/>
+              <w:start w:val="nil"/>
+              <w:top w:val="nil"/>
             </w:tcBorders>
           </w:tcPr>
           <w:p>
@@ -13071,7 +13434,7 @@
     <w:pPr>
       <w:keepNext/>
       <w:keepLines/>
-      <w:spacing w:before="0" w:after="200" w:line="240" w:lineRule="auto"/>
+      <w:spacing w:before="0" w:after="0" w:line="240" w:lineRule="auto"/>
       <w:jc w:val="left"/>
     </w:pPr>
     <w:rPr>
@@ -13079,6 +13442,7 @@
       <w:b/>
       <w:color w:val="016F3B"/>
       <w:sz w:val="15"/>
+      <w:szCs w:val="15"/>
     </w:rPr>
   </w:style>
   <w:style w:type="paragraph" w:customStyle="1" w:styleId="CRALogo">
@@ -13103,14 +13467,16 @@
     <w:pPr>
       <w:keepNext/>
       <w:keepLines/>
-      <w:spacing w:before="0" w:after="100" w:line="540" w:lineRule="exact"/>
+      <w:spacing w:before="0" w:after="55" w:line="540" w:lineRule="exact"/>
       <w:jc w:val="left"/>
     </w:pPr>
     <w:rPr>
       <w:rFonts w:ascii="Arial" w:hAnsi="Arial" w:eastAsia="Arial" w:cs="Arial"/>
       <w:b/>
       <w:color w:val="142019"/>
-      <w:sz w:val="53"/>
+      <w:sz w:val="52"/>
+      <w:szCs w:val="52"/>
+      <w:spacing w:val="-2"/>
     </w:rPr>
   </w:style>
   <w:style w:type="paragraph" w:customStyle="1" w:styleId="CRASubtitle">
@@ -13127,6 +13493,7 @@
       <w:b w:val="0"/>
       <w:color w:val="657169"/>
       <w:sz w:val="19"/>
+      <w:szCs w:val="19"/>
     </w:rPr>
   </w:style>
   <w:style w:type="paragraph" w:customStyle="1" w:styleId="CRAMetadataLabel">
@@ -13183,6 +13550,24 @@
     <w:pPr>
       <w:keepNext w:val="0"/>
       <w:keepLines/>
+      <w:spacing w:before="15" w:after="0" w:line="240" w:lineRule="auto"/>
+      <w:jc w:val="right"/>
+    </w:pPr>
+    <w:rPr>
+      <w:rFonts w:ascii="Arial" w:hAnsi="Arial" w:eastAsia="Arial" w:cs="Arial"/>
+      <w:b w:val="0"/>
+      <w:color w:val="56635B"/>
+      <w:sz w:val="18"/>
+      <w:szCs w:val="18"/>
+      <w:bCs w:val="0"/>
+    </w:rPr>
+  </w:style>
+  <w:style w:type="paragraph" w:customStyle="1" w:styleId="AgendaBreakTime">
+    <w:name w:val="Agenda Break Time"/>
+    <w:basedOn w:val="Normal"/>
+    <w:pPr>
+      <w:keepNext w:val="0"/>
+      <w:keepLines/>
       <w:spacing w:before="0" w:after="0" w:line="240" w:lineRule="auto"/>
       <w:jc w:val="right"/>
     </w:pPr>
@@ -13191,22 +13576,8 @@
       <w:b w:val="0"/>
       <w:color w:val="657169"/>
       <w:sz w:val="17"/>
-    </w:rPr>
-  </w:style>
-  <w:style w:type="paragraph" w:customStyle="1" w:styleId="AgendaBreakTime">
-    <w:name w:val="Agenda Break Time"/>
-    <w:basedOn w:val="Normal"/>
-    <w:pPr>
-      <w:keepNext w:val="0"/>
-      <w:keepLines/>
-      <w:spacing w:before="0" w:after="0" w:line="240" w:lineRule="auto"/>
-      <w:jc w:val="right"/>
-    </w:pPr>
-    <w:rPr>
-      <w:rFonts w:ascii="Arial" w:hAnsi="Arial" w:eastAsia="Arial" w:cs="Arial"/>
-      <w:b w:val="0"/>
-      <w:color w:val="657169"/>
-      <w:sz w:val="16"/>
+      <w:szCs w:val="17"/>
+      <w:bCs w:val="0"/>
     </w:rPr>
   </w:style>
   <w:style w:type="paragraph" w:customStyle="1" w:styleId="SessionNumber">
@@ -13231,14 +13602,15 @@
     <w:pPr>
       <w:keepNext/>
       <w:keepLines/>
-      <w:spacing w:before="0" w:after="60" w:line="240" w:lineRule="auto"/>
+      <w:spacing w:before="0" w:after="70" w:line="240" w:lineRule="auto"/>
       <w:jc w:val="left"/>
     </w:pPr>
     <w:rPr>
       <w:rFonts w:ascii="Arial" w:hAnsi="Arial" w:eastAsia="Arial" w:cs="Arial"/>
       <w:b/>
-      <w:color w:val="142019"/>
+      <w:color w:val="18231D"/>
       <w:sz w:val="21"/>
+      <w:szCs w:val="21"/>
     </w:rPr>
   </w:style>
   <w:style w:type="paragraph" w:customStyle="1" w:styleId="SessionDescription">
@@ -13255,6 +13627,7 @@
       <w:b w:val="0"/>
       <w:color w:val="455149"/>
       <w:sz w:val="18"/>
+      <w:szCs w:val="18"/>
     </w:rPr>
   </w:style>
   <w:style w:type="paragraph" w:customStyle="1" w:styleId="BreakLabel">
@@ -13271,6 +13644,7 @@
       <w:b w:val="0"/>
       <w:color w:val="016F3B"/>
       <w:sz w:val="16"/>
+      <w:szCs w:val="16"/>
     </w:rPr>
   </w:style>
 </w:styles>

</xml_diff>